<commit_message>
feat(docs) : ajout de rapport [WIP]
</commit_message>
<xml_diff>
--- a/docs/Rapport de projet.docx
+++ b/docs/Rapport de projet.docx
@@ -1,19 +1,13 @@
 
 <file path=word/document.xml><?xml version="1.0" encoding="utf-8"?>
-<w:document xmlns:wpc="http://schemas.microsoft.com/office/word/2010/wordprocessingCanvas" xmlns:cx="http://schemas.microsoft.com/office/drawing/2014/chartex" xmlns:cx1="http://schemas.microsoft.com/office/drawing/2015/9/8/chartex" xmlns:cx2="http://schemas.microsoft.com/office/drawing/2015/10/21/chartex" xmlns:cx3="http://schemas.microsoft.com/office/drawing/2016/5/9/chartex" xmlns:cx4="http://schemas.microsoft.com/office/drawing/2016/5/10/chartex" xmlns:cx5="http://schemas.microsoft.com/office/drawing/2016/5/11/chartex" xmlns:cx6="http://schemas.microsoft.com/office/drawing/2016/5/12/chartex" xmlns:cx7="http://schemas.microsoft.com/office/drawing/2016/5/13/chartex" xmlns:cx8="http://schemas.microsoft.com/office/drawing/2016/5/14/chartex" xmlns:mc="http://schemas.openxmlformats.org/markup-compatibility/2006" xmlns:aink="http://schemas.microsoft.com/office/drawing/2016/ink" xmlns:am3d="http://schemas.microsoft.com/office/drawing/2017/model3d" xmlns:o="urn:schemas-microsoft-com:office:office" xmlns:oel="http://schemas.microsoft.com/office/2019/extlst" xmlns:r="http://schemas.openxmlformats.org/officeDocument/2006/relationships" xmlns:m="http://schemas.openxmlformats.org/officeDocument/2006/math" xmlns:v="urn:schemas-microsoft-com:vml" xmlns:wp14="http://schemas.microsoft.com/office/word/2010/wordprocessingDrawing" xmlns:wp="http://schemas.openxmlformats.org/drawingml/2006/wordprocessingDrawing" xmlns:w10="urn:schemas-microsoft-com:office:word" xmlns:w="http://schemas.openxmlformats.org/wordprocessingml/2006/main" xmlns:w14="http://schemas.microsoft.com/office/word/2010/wordml" xmlns:w15="http://schemas.microsoft.com/office/word/2012/wordml" xmlns:w16cex="http://schemas.microsoft.com/office/word/2018/wordml/cex" xmlns:w16cid="http://schemas.microsoft.com/office/word/2016/wordml/cid" xmlns:w16="http://schemas.microsoft.com/office/word/2018/wordml" xmlns:w16du="http://schemas.microsoft.com/office/word/2023/wordml/word16du" xmlns:w16sdtdh="http://schemas.microsoft.com/office/word/2020/wordml/sdtdatahash" xmlns:w16sdtfl="http://schemas.microsoft.com/office/word/2024/wordml/sdtformatlock" xmlns:w16se="http://schemas.microsoft.com/office/word/2015/wordml/symex" xmlns:wpg="http://schemas.microsoft.com/office/word/2010/wordprocessingGroup" xmlns:wpi="http://schemas.microsoft.com/office/word/2010/wordprocessingInk" xmlns:wne="http://schemas.microsoft.com/office/word/2006/wordml" xmlns:wps="http://schemas.microsoft.com/office/word/2010/wordprocessingShape" mc:Ignorable="w14 w15 w16se w16cid w16 w16cex w16sdtdh w16sdtfl w16du wp14">
+<w:document xmlns:wpc="http://schemas.microsoft.com/office/word/2010/wordprocessingCanvas" xmlns:cx="http://schemas.microsoft.com/office/drawing/2014/chartex" xmlns:cx1="http://schemas.microsoft.com/office/drawing/2015/9/8/chartex" xmlns:cx2="http://schemas.microsoft.com/office/drawing/2015/10/21/chartex" xmlns:cx3="http://schemas.microsoft.com/office/drawing/2016/5/9/chartex" xmlns:cx4="http://schemas.microsoft.com/office/drawing/2016/5/10/chartex" xmlns:cx5="http://schemas.microsoft.com/office/drawing/2016/5/11/chartex" xmlns:cx6="http://schemas.microsoft.com/office/drawing/2016/5/12/chartex" xmlns:cx7="http://schemas.microsoft.com/office/drawing/2016/5/13/chartex" xmlns:cx8="http://schemas.microsoft.com/office/drawing/2016/5/14/chartex" xmlns:mc="http://schemas.openxmlformats.org/markup-compatibility/2006" xmlns:aink="http://schemas.microsoft.com/office/drawing/2016/ink" xmlns:am3d="http://schemas.microsoft.com/office/drawing/2017/model3d" xmlns:o="urn:schemas-microsoft-com:office:office" xmlns:oel="http://schemas.microsoft.com/office/2019/extlst" xmlns:r="http://schemas.openxmlformats.org/officeDocument/2006/relationships" xmlns:m="http://schemas.openxmlformats.org/officeDocument/2006/math" xmlns:v="urn:schemas-microsoft-com:vml" xmlns:wp14="http://schemas.microsoft.com/office/word/2010/wordprocessingDrawing" xmlns:wp="http://schemas.openxmlformats.org/drawingml/2006/wordprocessingDrawing" xmlns:w10="urn:schemas-microsoft-com:office:word" xmlns:w="http://schemas.openxmlformats.org/wordprocessingml/2006/main" xmlns:w14="http://schemas.microsoft.com/office/word/2010/wordml" xmlns:w15="http://schemas.microsoft.com/office/word/2012/wordml" xmlns:w16cex="http://schemas.microsoft.com/office/word/2018/wordml/cex" xmlns:w16cid="http://schemas.microsoft.com/office/word/2016/wordml/cid" xmlns:w16="http://schemas.microsoft.com/office/word/2018/wordml" xmlns:w16sdtdh="http://schemas.microsoft.com/office/word/2020/wordml/sdtdatahash" xmlns:w16se="http://schemas.microsoft.com/office/word/2015/wordml/symex" xmlns:wpg="http://schemas.microsoft.com/office/word/2010/wordprocessingGroup" xmlns:wpi="http://schemas.microsoft.com/office/word/2010/wordprocessingInk" xmlns:wne="http://schemas.microsoft.com/office/word/2006/wordml" xmlns:wps="http://schemas.microsoft.com/office/word/2010/wordprocessingShape" mc:Ignorable="w14 w15 w16se w16cid w16 w16cex w16sdtdh wp14">
   <w:body>
     <w:p>
       <w:pPr>
         <w:pStyle w:val="Titre"/>
       </w:pPr>
       <w:r>
-        <w:t xml:space="preserve">Titre </w:t>
-      </w:r>
-      <w:r>
-        <w:t xml:space="preserve">(nom) </w:t>
-      </w:r>
-      <w:r>
-        <w:t>du projet</w:t>
+        <w:t>P_WEB295</w:t>
       </w:r>
     </w:p>
     <w:p>
@@ -28,16 +22,13 @@
       </w:pPr>
       <w:r>
         <w:rPr>
-          <w:rFonts w:cs="Arial"/>
           <w:noProof/>
-          <w:sz w:val="22"/>
-          <w:szCs w:val="22"/>
         </w:rPr>
         <w:drawing>
-          <wp:inline distT="0" distB="0" distL="0" distR="0" wp14:anchorId="3CF85690" wp14:editId="1E1D98F9">
-            <wp:extent cx="3134995" cy="2558415"/>
-            <wp:effectExtent l="19050" t="0" r="8255" b="0"/>
-            <wp:docPr id="3" name="Image 3"/>
+          <wp:inline distT="0" distB="0" distL="0" distR="0" wp14:anchorId="2FEDA72F" wp14:editId="464C2E47">
+            <wp:extent cx="4468633" cy="1383653"/>
+            <wp:effectExtent l="0" t="0" r="0" b="7620"/>
+            <wp:docPr id="1506704059" name="Image 1"/>
             <wp:cNvGraphicFramePr>
               <a:graphicFrameLocks xmlns:a="http://schemas.openxmlformats.org/drawingml/2006/main" noChangeAspect="1"/>
             </wp:cNvGraphicFramePr>
@@ -45,13 +36,19 @@
               <a:graphicData uri="http://schemas.openxmlformats.org/drawingml/2006/picture">
                 <pic:pic xmlns:pic="http://schemas.openxmlformats.org/drawingml/2006/picture">
                   <pic:nvPicPr>
-                    <pic:cNvPr id="0" name="Picture 3"/>
+                    <pic:cNvPr id="0" name="Picture 2"/>
                     <pic:cNvPicPr>
                       <a:picLocks noChangeAspect="1" noChangeArrowheads="1"/>
                     </pic:cNvPicPr>
                   </pic:nvPicPr>
                   <pic:blipFill>
-                    <a:blip r:embed="rId11" cstate="print"/>
+                    <a:blip r:embed="rId11">
+                      <a:extLst>
+                        <a:ext uri="{28A0092B-C50C-407E-A947-70E740481C1C}">
+                          <a14:useLocalDpi xmlns:a14="http://schemas.microsoft.com/office/drawing/2010/main" val="0"/>
+                        </a:ext>
+                      </a:extLst>
+                    </a:blip>
                     <a:srcRect/>
                     <a:stretch>
                       <a:fillRect/>
@@ -60,17 +57,14 @@
                   <pic:spPr bwMode="auto">
                     <a:xfrm>
                       <a:off x="0" y="0"/>
-                      <a:ext cx="3134995" cy="2558415"/>
+                      <a:ext cx="4484203" cy="1388474"/>
                     </a:xfrm>
                     <a:prstGeom prst="rect">
                       <a:avLst/>
                     </a:prstGeom>
                     <a:noFill/>
-                    <a:ln w="9525">
+                    <a:ln>
                       <a:noFill/>
-                      <a:miter lim="800000"/>
-                      <a:headEnd/>
-                      <a:tailEnd/>
                     </a:ln>
                   </pic:spPr>
                 </pic:pic>
@@ -84,48 +78,47 @@
       <w:pPr>
         <w:jc w:val="center"/>
       </w:pPr>
-      <w:r>
-        <w:t>(</w:t>
-      </w:r>
-      <w:r>
-        <w:t>Une</w:t>
-      </w:r>
-      <w:r>
-        <w:t xml:space="preserve"> image originale représentant le projet)</w:t>
-      </w:r>
     </w:p>
     <w:p>
       <w:pPr>
         <w:spacing w:before="2000"/>
         <w:jc w:val="center"/>
-      </w:pPr>
-      <w:r>
-        <w:t>Nom</w:t>
-      </w:r>
-      <w:r>
-        <w:t>s</w:t>
-      </w:r>
-      <w:r>
-        <w:t xml:space="preserve"> de</w:t>
-      </w:r>
-      <w:r>
-        <w:t xml:space="preserve">s </w:t>
-      </w:r>
-      <w:r>
-        <w:t>auteur</w:t>
-      </w:r>
-      <w:r>
-        <w:t>s</w:t>
-      </w:r>
-      <w:r>
-        <w:t xml:space="preserve"> du groupe</w:t>
-      </w:r>
+        <w:rPr>
+          <w:lang w:val="de-CH"/>
+        </w:rPr>
+      </w:pPr>
+      <w:r>
+        <w:rPr>
+          <w:lang w:val="de-CH"/>
+        </w:rPr>
+        <w:t>Kiril Bormin, Damie</w:t>
+      </w:r>
+      <w:r>
+        <w:rPr>
+          <w:lang w:val="de-CH"/>
+        </w:rPr>
+        <w:t xml:space="preserve">n </w:t>
+      </w:r>
+      <w:proofErr w:type="spellStart"/>
+      <w:r>
+        <w:rPr>
+          <w:lang w:val="de-CH"/>
+        </w:rPr>
+        <w:t>Chabal</w:t>
+      </w:r>
+      <w:proofErr w:type="spellEnd"/>
     </w:p>
     <w:p>
       <w:pPr>
         <w:jc w:val="center"/>
-      </w:pPr>
-      <w:r>
+        <w:rPr>
+          <w:lang w:val="de-CH"/>
+        </w:rPr>
+      </w:pPr>
+      <w:r>
+        <w:rPr>
+          <w:lang w:val="de-CH"/>
+        </w:rPr>
         <w:t>ETML</w:t>
       </w:r>
     </w:p>
@@ -134,7 +127,13 @@
         <w:jc w:val="center"/>
       </w:pPr>
       <w:r>
-        <w:t>Date début/fin</w:t>
+        <w:t xml:space="preserve">28.04.2026 </w:t>
+      </w:r>
+      <w:r>
+        <w:t xml:space="preserve">- </w:t>
+      </w:r>
+      <w:r>
+        <w:t>27.05.2026</w:t>
       </w:r>
     </w:p>
     <w:p>
@@ -142,8 +141,13 @@
         <w:jc w:val="center"/>
       </w:pPr>
       <w:r>
-        <w:t>Nom du client</w:t>
-      </w:r>
+        <w:t xml:space="preserve">Antoine </w:t>
+      </w:r>
+      <w:proofErr w:type="spellStart"/>
+      <w:r>
+        <w:t>Mveng</w:t>
+      </w:r>
+      <w:proofErr w:type="spellEnd"/>
     </w:p>
     <w:p>
       <w:pPr>
@@ -2080,208 +2084,1862 @@
     </w:p>
     <w:p>
       <w:pPr>
-        <w:pStyle w:val="Informations"/>
-      </w:pPr>
-      <w:r>
-        <w:t xml:space="preserve">A </w:t>
-      </w:r>
+        <w:pStyle w:val="Retraitcorpsdetexte"/>
+      </w:pPr>
+      <w:proofErr w:type="spellStart"/>
+      <w:r>
+        <w:t>P_Web</w:t>
+      </w:r>
+      <w:proofErr w:type="spellEnd"/>
+      <w:r>
+        <w:t xml:space="preserve"> 295 : Passion Lecture avec </w:t>
+      </w:r>
+      <w:proofErr w:type="spellStart"/>
+      <w:r>
+        <w:t>Adoni</w:t>
+      </w:r>
+      <w:r>
+        <w:t>s</w:t>
+      </w:r>
+      <w:r>
+        <w:t>JS</w:t>
+      </w:r>
+      <w:proofErr w:type="spellEnd"/>
+    </w:p>
+    <w:p>
+      <w:pPr>
+        <w:pStyle w:val="Titre2"/>
+      </w:pPr>
+      <w:bookmarkStart w:id="6" w:name="_Toc71040025"/>
+      <w:r>
+        <w:t>Description</w:t>
+      </w:r>
+      <w:bookmarkEnd w:id="6"/>
+    </w:p>
+    <w:p>
+      <w:pPr>
+        <w:pStyle w:val="Retraitcorpsdetexte"/>
+      </w:pPr>
+      <w:r>
+        <w:t>Le projet consiste à réaliser une application API qui manipule une base de données et fournis ces données au frontend « Passion Lecture ». Qui permet de lire, d’ajouter, de mettre à jour et de supprimer des livres, des auteurs, des éditeurs et des catégories. L’application contient également un système d’authentification et de gestion d’</w:t>
+      </w:r>
+      <w:r>
+        <w:t xml:space="preserve">accès des utilisateurs. </w:t>
+      </w:r>
+    </w:p>
+    <w:p>
+      <w:pPr>
+        <w:pStyle w:val="Retraitcorpsdetexte"/>
+      </w:pPr>
+    </w:p>
+    <w:p>
+      <w:pPr>
+        <w:pStyle w:val="Retraitcorpsdetexte"/>
+      </w:pPr>
+    </w:p>
+    <w:p>
+      <w:pPr>
+        <w:pStyle w:val="Titre1"/>
+      </w:pPr>
+      <w:bookmarkStart w:id="7" w:name="_Toc71040026"/>
+      <w:r>
+        <w:t>Planification</w:t>
+      </w:r>
+      <w:bookmarkEnd w:id="4"/>
+      <w:bookmarkEnd w:id="5"/>
+      <w:r>
+        <w:t>/Gestion projet</w:t>
+      </w:r>
+      <w:bookmarkEnd w:id="7"/>
+    </w:p>
+    <w:p>
+      <w:pPr>
+        <w:pStyle w:val="Corpsdetexte"/>
+      </w:pPr>
+      <w:r>
+        <w:t>Dans ce projet, nous avons utilisé GitHub Project pour organiser et suivre les tâches.</w:t>
+      </w:r>
+    </w:p>
+    <w:p>
+      <w:pPr>
+        <w:pStyle w:val="Corpsdetexte"/>
+      </w:pPr>
+      <w:r>
+        <w:t>Voici une capture d’écran prise pendant la 3</w:t>
+      </w:r>
+      <w:r>
+        <w:rPr>
+          <w:vertAlign w:val="superscript"/>
+        </w:rPr>
+        <w:t>ème</w:t>
+      </w:r>
+      <w:r>
+        <w:t xml:space="preserve"> semaine de projet</w:t>
+      </w:r>
+    </w:p>
+    <w:p>
+      <w:pPr>
+        <w:pStyle w:val="Corpsdetexte"/>
+        <w:ind w:left="0"/>
+      </w:pPr>
+      <w:r>
+        <w:rPr>
+          <w:noProof/>
+        </w:rPr>
+        <w:drawing>
+          <wp:inline distT="0" distB="0" distL="0" distR="0" wp14:anchorId="3F053D0B" wp14:editId="7AD480FE">
+            <wp:extent cx="5548384" cy="3373075"/>
+            <wp:effectExtent l="190500" t="190500" r="186055" b="189865"/>
+            <wp:docPr id="1052387520" name="Image 1"/>
+            <wp:cNvGraphicFramePr>
+              <a:graphicFrameLocks xmlns:a="http://schemas.openxmlformats.org/drawingml/2006/main" noChangeAspect="1"/>
+            </wp:cNvGraphicFramePr>
+            <a:graphic xmlns:a="http://schemas.openxmlformats.org/drawingml/2006/main">
+              <a:graphicData uri="http://schemas.openxmlformats.org/drawingml/2006/picture">
+                <pic:pic xmlns:pic="http://schemas.openxmlformats.org/drawingml/2006/picture">
+                  <pic:nvPicPr>
+                    <pic:cNvPr id="1052387520" name=""/>
+                    <pic:cNvPicPr/>
+                  </pic:nvPicPr>
+                  <pic:blipFill>
+                    <a:blip r:embed="rId12"/>
+                    <a:stretch>
+                      <a:fillRect/>
+                    </a:stretch>
+                  </pic:blipFill>
+                  <pic:spPr>
+                    <a:xfrm>
+                      <a:off x="0" y="0"/>
+                      <a:ext cx="5553696" cy="3376305"/>
+                    </a:xfrm>
+                    <a:prstGeom prst="rect">
+                      <a:avLst/>
+                    </a:prstGeom>
+                    <a:ln>
+                      <a:noFill/>
+                    </a:ln>
+                    <a:effectLst>
+                      <a:outerShdw blurRad="190500" algn="tl" rotWithShape="0">
+                        <a:srgbClr val="000000">
+                          <a:alpha val="70000"/>
+                        </a:srgbClr>
+                      </a:outerShdw>
+                    </a:effectLst>
+                  </pic:spPr>
+                </pic:pic>
+              </a:graphicData>
+            </a:graphic>
+          </wp:inline>
+        </w:drawing>
+      </w:r>
+    </w:p>
+    <w:p>
+      <w:pPr>
+        <w:pStyle w:val="Titre1"/>
+      </w:pPr>
+      <w:bookmarkStart w:id="8" w:name="_Toc71040027"/>
+      <w:r>
+        <w:t>Points techniques</w:t>
+      </w:r>
+      <w:bookmarkEnd w:id="8"/>
+    </w:p>
+    <w:p>
+      <w:pPr>
+        <w:pStyle w:val="Titre2"/>
+      </w:pPr>
+      <w:r>
+        <w:t>Routes</w:t>
+      </w:r>
+    </w:p>
+    <w:p>
+      <w:pPr>
+        <w:pStyle w:val="Retraitcorpsdetexte"/>
+      </w:pPr>
+      <w:r>
+        <w:t>Nous avons réalisé un ensemble des routes pour chaque table, avec les 4 opérations fondamentales CRUD.</w:t>
+      </w:r>
+    </w:p>
+    <w:p>
+      <w:pPr>
+        <w:pStyle w:val="Retraitcorpsdetexte"/>
+      </w:pPr>
+    </w:p>
+    <w:p>
+      <w:pPr>
+        <w:pStyle w:val="Retraitcorpsdetexte"/>
+      </w:pPr>
+      <w:r>
+        <w:t xml:space="preserve">Voici un exemple avec </w:t>
+      </w:r>
+      <w:r>
+        <w:t>auteur</w:t>
+      </w:r>
+      <w:r>
+        <w:t xml:space="preserve"> routes </w:t>
+      </w:r>
+    </w:p>
+    <w:p>
+      <w:pPr>
+        <w:pStyle w:val="Retraitcorpsdetexte"/>
+      </w:pPr>
+      <w:r>
+        <w:lastRenderedPageBreak/>
+        <w:drawing>
+          <wp:inline distT="0" distB="0" distL="0" distR="0" wp14:anchorId="13B2EC23" wp14:editId="702C249C">
+            <wp:extent cx="4653886" cy="1368458"/>
+            <wp:effectExtent l="0" t="0" r="0" b="3175"/>
+            <wp:docPr id="1417988461" name="Image 1"/>
+            <wp:cNvGraphicFramePr>
+              <a:graphicFrameLocks xmlns:a="http://schemas.openxmlformats.org/drawingml/2006/main" noChangeAspect="1"/>
+            </wp:cNvGraphicFramePr>
+            <a:graphic xmlns:a="http://schemas.openxmlformats.org/drawingml/2006/main">
+              <a:graphicData uri="http://schemas.openxmlformats.org/drawingml/2006/picture">
+                <pic:pic xmlns:pic="http://schemas.openxmlformats.org/drawingml/2006/picture">
+                  <pic:nvPicPr>
+                    <pic:cNvPr id="1417988461" name=""/>
+                    <pic:cNvPicPr/>
+                  </pic:nvPicPr>
+                  <pic:blipFill>
+                    <a:blip r:embed="rId13"/>
+                    <a:stretch>
+                      <a:fillRect/>
+                    </a:stretch>
+                  </pic:blipFill>
+                  <pic:spPr>
+                    <a:xfrm>
+                      <a:off x="0" y="0"/>
+                      <a:ext cx="4673641" cy="1374267"/>
+                    </a:xfrm>
+                    <a:prstGeom prst="rect">
+                      <a:avLst/>
+                    </a:prstGeom>
+                  </pic:spPr>
+                </pic:pic>
+              </a:graphicData>
+            </a:graphic>
+          </wp:inline>
+        </w:drawing>
+      </w:r>
+    </w:p>
+    <w:p>
+      <w:pPr>
+        <w:pStyle w:val="Retraitcorpsdetexte"/>
+      </w:pPr>
+    </w:p>
+    <w:p>
+      <w:pPr>
+        <w:pStyle w:val="Titre2"/>
+      </w:pPr>
+      <w:r>
+        <w:t>Validateur</w:t>
+      </w:r>
+    </w:p>
+    <w:p>
+      <w:pPr>
+        <w:pStyle w:val="Retraitcorpsdetexte"/>
+      </w:pPr>
+      <w:r>
+        <w:t>Nous avons</w:t>
+      </w:r>
+      <w:r>
+        <w:t xml:space="preserve"> fait des validateurs pour chaque table, afin de protéger les inserts dans la </w:t>
+      </w:r>
+      <w:proofErr w:type="spellStart"/>
+      <w:r>
+        <w:t>db</w:t>
+      </w:r>
+      <w:proofErr w:type="spellEnd"/>
+    </w:p>
+    <w:p>
+      <w:pPr>
+        <w:pStyle w:val="Retraitcorpsdetexte"/>
+      </w:pPr>
+      <w:r>
+        <w:t>Voici un exemple avec le validateur des livres.</w:t>
+      </w:r>
+    </w:p>
+    <w:p>
+      <w:pPr>
+        <w:pStyle w:val="Retraitcorpsdetexte"/>
+        <w:ind w:left="2124"/>
+      </w:pPr>
+      <w:r>
+        <w:tab/>
+      </w:r>
+      <w:r>
+        <w:drawing>
+          <wp:inline distT="0" distB="0" distL="0" distR="0" wp14:anchorId="7C29520D" wp14:editId="102C77D3">
+            <wp:extent cx="3084394" cy="1689072"/>
+            <wp:effectExtent l="0" t="0" r="1905" b="6985"/>
+            <wp:docPr id="883188673" name="Image 1"/>
+            <wp:cNvGraphicFramePr>
+              <a:graphicFrameLocks xmlns:a="http://schemas.openxmlformats.org/drawingml/2006/main" noChangeAspect="1"/>
+            </wp:cNvGraphicFramePr>
+            <a:graphic xmlns:a="http://schemas.openxmlformats.org/drawingml/2006/main">
+              <a:graphicData uri="http://schemas.openxmlformats.org/drawingml/2006/picture">
+                <pic:pic xmlns:pic="http://schemas.openxmlformats.org/drawingml/2006/picture">
+                  <pic:nvPicPr>
+                    <pic:cNvPr id="883188673" name=""/>
+                    <pic:cNvPicPr/>
+                  </pic:nvPicPr>
+                  <pic:blipFill>
+                    <a:blip r:embed="rId14"/>
+                    <a:stretch>
+                      <a:fillRect/>
+                    </a:stretch>
+                  </pic:blipFill>
+                  <pic:spPr>
+                    <a:xfrm>
+                      <a:off x="0" y="0"/>
+                      <a:ext cx="3110949" cy="1703614"/>
+                    </a:xfrm>
+                    <a:prstGeom prst="rect">
+                      <a:avLst/>
+                    </a:prstGeom>
+                  </pic:spPr>
+                </pic:pic>
+              </a:graphicData>
+            </a:graphic>
+          </wp:inline>
+        </w:drawing>
+      </w:r>
+    </w:p>
+    <w:p>
+      <w:pPr>
+        <w:pStyle w:val="Retraitcorpsdetexte"/>
+      </w:pPr>
+    </w:p>
+    <w:p>
+      <w:pPr>
+        <w:pStyle w:val="Titre2"/>
+      </w:pPr>
+      <w:r>
+        <w:t>Gestion des statuts http</w:t>
+      </w:r>
+    </w:p>
+    <w:p>
+      <w:pPr>
+        <w:pStyle w:val="Retraitcorpsdetexte"/>
+      </w:pPr>
+      <w:r>
+        <w:t>Nous avons mis en place les codes http correctes pour les verbes d’acronyme CRUD nécessaires</w:t>
+      </w:r>
+    </w:p>
+    <w:p>
+      <w:pPr>
+        <w:pStyle w:val="Retraitcorpsdetexte"/>
+      </w:pPr>
+    </w:p>
+    <w:p>
+      <w:pPr>
+        <w:pStyle w:val="Retraitcorpsdetexte"/>
+      </w:pPr>
+      <w:r>
+        <w:t>Pour les requêtes « </w:t>
+      </w:r>
+      <w:proofErr w:type="spellStart"/>
+      <w:r>
+        <w:t>read</w:t>
+      </w:r>
+      <w:proofErr w:type="spellEnd"/>
+      <w:r>
+        <w:t> » et « update » nous envoyons le code 200 (OK) ¨</w:t>
+      </w:r>
+    </w:p>
+    <w:p>
+      <w:pPr>
+        <w:shd w:val="clear" w:color="auto" w:fill="1F1F1F"/>
+        <w:spacing w:line="285" w:lineRule="atLeast"/>
+        <w:rPr>
+          <w:rFonts w:ascii="Consolas" w:hAnsi="Consolas"/>
+          <w:color w:val="9CDCFE"/>
+          <w:sz w:val="16"/>
+          <w:szCs w:val="16"/>
+        </w:rPr>
+      </w:pPr>
+      <w:proofErr w:type="gramStart"/>
+      <w:r>
+        <w:rPr>
+          <w:rFonts w:ascii="Consolas" w:hAnsi="Consolas"/>
+          <w:color w:val="9CDCFE"/>
+          <w:sz w:val="16"/>
+          <w:szCs w:val="16"/>
+        </w:rPr>
+        <w:t>return</w:t>
+      </w:r>
+      <w:proofErr w:type="gramEnd"/>
+      <w:r>
+        <w:rPr>
+          <w:rFonts w:ascii="Consolas" w:hAnsi="Consolas"/>
+          <w:color w:val="9CDCFE"/>
+          <w:sz w:val="16"/>
+          <w:szCs w:val="16"/>
+        </w:rPr>
+        <w:t xml:space="preserve"> </w:t>
+      </w:r>
+      <w:proofErr w:type="spellStart"/>
+      <w:r>
+        <w:rPr>
+          <w:rFonts w:ascii="Consolas" w:hAnsi="Consolas"/>
+          <w:color w:val="9CDCFE"/>
+          <w:sz w:val="16"/>
+          <w:szCs w:val="16"/>
+        </w:rPr>
+        <w:t>response.ok</w:t>
+      </w:r>
+      <w:proofErr w:type="spellEnd"/>
+      <w:r>
+        <w:rPr>
+          <w:rFonts w:ascii="Consolas" w:hAnsi="Consolas"/>
+          <w:color w:val="9CDCFE"/>
+          <w:sz w:val="16"/>
+          <w:szCs w:val="16"/>
+        </w:rPr>
+        <w:t>(</w:t>
+      </w:r>
+      <w:r>
+        <w:rPr>
+          <w:rFonts w:ascii="Consolas" w:hAnsi="Consolas"/>
+          <w:color w:val="4FC1FF"/>
+          <w:sz w:val="16"/>
+          <w:szCs w:val="16"/>
+        </w:rPr>
+        <w:t>book</w:t>
+      </w:r>
+      <w:r>
+        <w:rPr>
+          <w:rFonts w:ascii="Consolas" w:hAnsi="Consolas"/>
+          <w:color w:val="9CDCFE"/>
+          <w:sz w:val="16"/>
+          <w:szCs w:val="16"/>
+        </w:rPr>
+        <w:t xml:space="preserve">) </w:t>
+      </w:r>
+      <w:r>
+        <w:rPr>
+          <w:rFonts w:ascii="Consolas" w:hAnsi="Consolas"/>
+          <w:color w:val="6A9955"/>
+          <w:sz w:val="16"/>
+          <w:szCs w:val="16"/>
+        </w:rPr>
+        <w:t>// envoyer la réponse 200 (OK)</w:t>
+      </w:r>
+    </w:p>
+    <w:p>
+      <w:pPr>
+        <w:pStyle w:val="Retraitcorpsdetexte"/>
+      </w:pPr>
+    </w:p>
+    <w:p>
+      <w:pPr>
+        <w:pStyle w:val="Retraitcorpsdetexte"/>
+      </w:pPr>
+      <w:r>
+        <w:t xml:space="preserve">Ici nous envoyons le code 201 où cas où un livre (dans cet exemple) a été créé avec succès. Code 201 veut dire </w:t>
+      </w:r>
+      <w:proofErr w:type="spellStart"/>
+      <w:r>
+        <w:t>Created</w:t>
+      </w:r>
+      <w:proofErr w:type="spellEnd"/>
+      <w:r>
+        <w:t xml:space="preserve"> (Créé).</w:t>
+      </w:r>
+    </w:p>
+    <w:p>
+      <w:pPr>
+        <w:shd w:val="clear" w:color="auto" w:fill="1F1F1F"/>
+        <w:spacing w:line="285" w:lineRule="atLeast"/>
+        <w:rPr>
+          <w:rFonts w:ascii="Consolas" w:hAnsi="Consolas"/>
+          <w:color w:val="9CDCFE"/>
+          <w:sz w:val="16"/>
+          <w:szCs w:val="16"/>
+        </w:rPr>
+      </w:pPr>
+      <w:proofErr w:type="gramStart"/>
+      <w:r>
+        <w:rPr>
+          <w:rFonts w:ascii="Consolas" w:hAnsi="Consolas"/>
+          <w:color w:val="9CDCFE"/>
+          <w:sz w:val="16"/>
+          <w:szCs w:val="16"/>
+        </w:rPr>
+        <w:t>r</w:t>
+      </w:r>
+      <w:r>
+        <w:rPr>
+          <w:rFonts w:ascii="Consolas" w:hAnsi="Consolas"/>
+          <w:color w:val="9CDCFE"/>
+          <w:sz w:val="16"/>
+          <w:szCs w:val="16"/>
+        </w:rPr>
+        <w:t>eturn</w:t>
+      </w:r>
+      <w:proofErr w:type="gramEnd"/>
+      <w:r>
+        <w:rPr>
+          <w:rFonts w:ascii="Consolas" w:hAnsi="Consolas"/>
+          <w:color w:val="9CDCFE"/>
+          <w:sz w:val="16"/>
+          <w:szCs w:val="16"/>
+        </w:rPr>
+        <w:t xml:space="preserve"> </w:t>
+      </w:r>
+      <w:proofErr w:type="spellStart"/>
+      <w:r>
+        <w:rPr>
+          <w:rFonts w:ascii="Consolas" w:hAnsi="Consolas"/>
+          <w:color w:val="9CDCFE"/>
+          <w:sz w:val="16"/>
+          <w:szCs w:val="16"/>
+        </w:rPr>
+        <w:t>response</w:t>
+      </w:r>
+      <w:r>
+        <w:rPr>
+          <w:rFonts w:ascii="Consolas" w:hAnsi="Consolas"/>
+          <w:color w:val="CCCCCC"/>
+          <w:sz w:val="16"/>
+          <w:szCs w:val="16"/>
+        </w:rPr>
+        <w:t>.</w:t>
+      </w:r>
+      <w:r>
+        <w:rPr>
+          <w:rFonts w:ascii="Consolas" w:hAnsi="Consolas"/>
+          <w:color w:val="DCDCAA"/>
+          <w:sz w:val="16"/>
+          <w:szCs w:val="16"/>
+        </w:rPr>
+        <w:t>created</w:t>
+      </w:r>
+      <w:proofErr w:type="spellEnd"/>
+      <w:r>
+        <w:rPr>
+          <w:rFonts w:ascii="Consolas" w:hAnsi="Consolas"/>
+          <w:color w:val="CCCCCC"/>
+          <w:sz w:val="16"/>
+          <w:szCs w:val="16"/>
+        </w:rPr>
+        <w:t>(</w:t>
+      </w:r>
+      <w:r>
+        <w:rPr>
+          <w:rFonts w:ascii="Consolas" w:hAnsi="Consolas"/>
+          <w:color w:val="4FC1FF"/>
+          <w:sz w:val="16"/>
+          <w:szCs w:val="16"/>
+        </w:rPr>
+        <w:t>book</w:t>
+      </w:r>
+      <w:r>
+        <w:rPr>
+          <w:rFonts w:ascii="Consolas" w:hAnsi="Consolas"/>
+          <w:color w:val="CCCCCC"/>
+          <w:sz w:val="16"/>
+          <w:szCs w:val="16"/>
+        </w:rPr>
+        <w:t xml:space="preserve">) </w:t>
+      </w:r>
+      <w:r>
+        <w:rPr>
+          <w:rFonts w:ascii="Consolas" w:hAnsi="Consolas"/>
+          <w:color w:val="6A9955"/>
+          <w:sz w:val="16"/>
+          <w:szCs w:val="16"/>
+        </w:rPr>
+        <w:t>// envoyer la réponse 201 (</w:t>
+      </w:r>
+      <w:proofErr w:type="spellStart"/>
+      <w:r>
+        <w:rPr>
+          <w:rFonts w:ascii="Consolas" w:hAnsi="Consolas"/>
+          <w:color w:val="6A9955"/>
+          <w:sz w:val="16"/>
+          <w:szCs w:val="16"/>
+        </w:rPr>
+        <w:t>Created</w:t>
+      </w:r>
+      <w:proofErr w:type="spellEnd"/>
+      <w:r>
+        <w:rPr>
+          <w:rFonts w:ascii="Consolas" w:hAnsi="Consolas"/>
+          <w:color w:val="6A9955"/>
+          <w:sz w:val="16"/>
+          <w:szCs w:val="16"/>
+        </w:rPr>
+        <w:t>) avec l'objet créé</w:t>
+      </w:r>
+    </w:p>
+    <w:p>
+      <w:pPr>
+        <w:pStyle w:val="Retraitcorpsdetexte"/>
+      </w:pPr>
+    </w:p>
+    <w:p>
+      <w:pPr>
+        <w:pStyle w:val="Retraitcorpsdetexte"/>
+      </w:pPr>
+      <w:r>
+        <w:t>Et pour la requête « </w:t>
+      </w:r>
+      <w:proofErr w:type="spellStart"/>
+      <w:r>
+        <w:t>delete</w:t>
+      </w:r>
+      <w:proofErr w:type="spellEnd"/>
+      <w:r>
+        <w:t> » nous envoyons à l’utilisateur le code 204 (No content)</w:t>
+      </w:r>
+    </w:p>
+    <w:p>
+      <w:pPr>
+        <w:shd w:val="clear" w:color="auto" w:fill="1F1F1F"/>
+        <w:spacing w:line="285" w:lineRule="atLeast"/>
+        <w:rPr>
+          <w:rFonts w:ascii="Consolas" w:hAnsi="Consolas"/>
+          <w:color w:val="CCCCCC"/>
+          <w:sz w:val="16"/>
+          <w:szCs w:val="16"/>
+        </w:rPr>
+      </w:pPr>
+      <w:proofErr w:type="gramStart"/>
+      <w:r>
+        <w:rPr>
+          <w:rFonts w:ascii="Consolas" w:hAnsi="Consolas"/>
+          <w:color w:val="C586C0"/>
+          <w:sz w:val="16"/>
+          <w:szCs w:val="16"/>
+        </w:rPr>
+        <w:t>return</w:t>
+      </w:r>
+      <w:proofErr w:type="gramEnd"/>
+      <w:r>
+        <w:rPr>
+          <w:rFonts w:ascii="Consolas" w:hAnsi="Consolas"/>
+          <w:color w:val="CCCCCC"/>
+          <w:sz w:val="16"/>
+          <w:szCs w:val="16"/>
+        </w:rPr>
+        <w:t xml:space="preserve"> </w:t>
+      </w:r>
+      <w:proofErr w:type="spellStart"/>
+      <w:r>
+        <w:rPr>
+          <w:rFonts w:ascii="Consolas" w:hAnsi="Consolas"/>
+          <w:color w:val="9CDCFE"/>
+          <w:sz w:val="16"/>
+          <w:szCs w:val="16"/>
+        </w:rPr>
+        <w:t>response</w:t>
+      </w:r>
+      <w:r>
+        <w:rPr>
+          <w:rFonts w:ascii="Consolas" w:hAnsi="Consolas"/>
+          <w:color w:val="CCCCCC"/>
+          <w:sz w:val="16"/>
+          <w:szCs w:val="16"/>
+        </w:rPr>
+        <w:t>.</w:t>
+      </w:r>
+      <w:r>
+        <w:rPr>
+          <w:rFonts w:ascii="Consolas" w:hAnsi="Consolas"/>
+          <w:color w:val="DCDCAA"/>
+          <w:sz w:val="16"/>
+          <w:szCs w:val="16"/>
+        </w:rPr>
+        <w:t>noContent</w:t>
+      </w:r>
+      <w:proofErr w:type="spellEnd"/>
+      <w:r>
+        <w:rPr>
+          <w:rFonts w:ascii="Consolas" w:hAnsi="Consolas"/>
+          <w:color w:val="CCCCCC"/>
+          <w:sz w:val="16"/>
+          <w:szCs w:val="16"/>
+        </w:rPr>
+        <w:t xml:space="preserve">() </w:t>
+      </w:r>
+      <w:r>
+        <w:rPr>
+          <w:rFonts w:ascii="Consolas" w:hAnsi="Consolas"/>
+          <w:color w:val="6A9955"/>
+          <w:sz w:val="16"/>
+          <w:szCs w:val="16"/>
+        </w:rPr>
+        <w:t>// renvoie le code 204 ( No Content )</w:t>
+      </w:r>
+    </w:p>
+    <w:p>
+      <w:pPr>
+        <w:pStyle w:val="Titre2"/>
+      </w:pPr>
+      <w:r>
+        <w:t>Recherche</w:t>
+      </w:r>
+    </w:p>
+    <w:p>
+      <w:pPr>
+        <w:pStyle w:val="Retraitcorpsdetexte"/>
+      </w:pPr>
+      <w:r>
+        <w:t xml:space="preserve">Un système de recherche a été implémenté, qui prend les paramètres de l’url </w:t>
+      </w:r>
+      <w:r>
+        <w:t>et fait une requête à la base de données avec les paramètres de recherche donné.</w:t>
+      </w:r>
+    </w:p>
+    <w:p>
+      <w:pPr>
+        <w:shd w:val="clear" w:color="auto" w:fill="1F1F1F"/>
+        <w:spacing w:line="285" w:lineRule="atLeast"/>
+        <w:rPr>
+          <w:rFonts w:ascii="Consolas" w:hAnsi="Consolas"/>
+          <w:color w:val="CCCCCC"/>
+          <w:sz w:val="16"/>
+          <w:szCs w:val="16"/>
+        </w:rPr>
+      </w:pPr>
       <w:proofErr w:type="spellStart"/>
       <w:proofErr w:type="gramStart"/>
       <w:r>
-        <w:t>compléter</w:t>
-      </w:r>
-      <w:r>
-        <w:t>,</w:t>
-      </w:r>
-      <w:r>
-        <w:t>par</w:t>
+        <w:rPr>
+          <w:rFonts w:ascii="Consolas" w:hAnsi="Consolas"/>
+          <w:color w:val="569CD6"/>
+          <w:sz w:val="16"/>
+          <w:szCs w:val="16"/>
+        </w:rPr>
+        <w:t>const</w:t>
       </w:r>
       <w:proofErr w:type="spellEnd"/>
       <w:proofErr w:type="gramEnd"/>
       <w:r>
-        <w:t xml:space="preserve"> un titre cours et pertinent. </w:t>
-      </w:r>
-      <w:r>
-        <w:t xml:space="preserve">Cela peut être une reprise ou compléter le titre de la première page </w:t>
-      </w:r>
-      <w:r>
-        <w:t xml:space="preserve">… </w:t>
-      </w:r>
-    </w:p>
-    <w:p>
-      <w:pPr>
-        <w:pStyle w:val="Titre2"/>
-      </w:pPr>
-      <w:bookmarkStart w:id="6" w:name="_Toc71040025"/>
-      <w:r>
-        <w:t>Description</w:t>
-      </w:r>
-      <w:bookmarkEnd w:id="6"/>
-    </w:p>
-    <w:p>
-      <w:pPr>
-        <w:pStyle w:val="Informations"/>
-      </w:pPr>
-      <w:r>
-        <w:t xml:space="preserve">A </w:t>
+        <w:rPr>
+          <w:rFonts w:ascii="Consolas" w:hAnsi="Consolas"/>
+          <w:color w:val="CCCCCC"/>
+          <w:sz w:val="16"/>
+          <w:szCs w:val="16"/>
+        </w:rPr>
+        <w:t xml:space="preserve"> </w:t>
+      </w:r>
+      <w:r>
+        <w:rPr>
+          <w:rFonts w:ascii="Consolas" w:hAnsi="Consolas"/>
+          <w:color w:val="4FC1FF"/>
+          <w:sz w:val="16"/>
+          <w:szCs w:val="16"/>
+        </w:rPr>
+        <w:t>q</w:t>
+      </w:r>
+      <w:r>
+        <w:rPr>
+          <w:rFonts w:ascii="Consolas" w:hAnsi="Consolas"/>
+          <w:color w:val="CCCCCC"/>
+          <w:sz w:val="16"/>
+          <w:szCs w:val="16"/>
+        </w:rPr>
+        <w:t xml:space="preserve"> </w:t>
+      </w:r>
+      <w:r>
+        <w:rPr>
+          <w:rFonts w:ascii="Consolas" w:hAnsi="Consolas"/>
+          <w:color w:val="D4D4D4"/>
+          <w:sz w:val="16"/>
+          <w:szCs w:val="16"/>
+        </w:rPr>
+        <w:t>=</w:t>
+      </w:r>
+      <w:r>
+        <w:rPr>
+          <w:rFonts w:ascii="Consolas" w:hAnsi="Consolas"/>
+          <w:color w:val="CCCCCC"/>
+          <w:sz w:val="16"/>
+          <w:szCs w:val="16"/>
+        </w:rPr>
+        <w:t xml:space="preserve"> </w:t>
+      </w:r>
+      <w:proofErr w:type="spellStart"/>
+      <w:r>
+        <w:rPr>
+          <w:rFonts w:ascii="Consolas" w:hAnsi="Consolas"/>
+          <w:color w:val="9CDCFE"/>
+          <w:sz w:val="16"/>
+          <w:szCs w:val="16"/>
+        </w:rPr>
+        <w:t>request</w:t>
+      </w:r>
+      <w:r>
+        <w:rPr>
+          <w:rFonts w:ascii="Consolas" w:hAnsi="Consolas"/>
+          <w:color w:val="CCCCCC"/>
+          <w:sz w:val="16"/>
+          <w:szCs w:val="16"/>
+        </w:rPr>
+        <w:t>.</w:t>
+      </w:r>
+      <w:r>
+        <w:rPr>
+          <w:rFonts w:ascii="Consolas" w:hAnsi="Consolas"/>
+          <w:color w:val="DCDCAA"/>
+          <w:sz w:val="16"/>
+          <w:szCs w:val="16"/>
+        </w:rPr>
+        <w:t>input</w:t>
+      </w:r>
+      <w:proofErr w:type="spellEnd"/>
+      <w:r>
+        <w:rPr>
+          <w:rFonts w:ascii="Consolas" w:hAnsi="Consolas"/>
+          <w:color w:val="CCCCCC"/>
+          <w:sz w:val="16"/>
+          <w:szCs w:val="16"/>
+        </w:rPr>
+        <w:t>(</w:t>
+      </w:r>
+      <w:r>
+        <w:rPr>
+          <w:rFonts w:ascii="Consolas" w:hAnsi="Consolas"/>
+          <w:color w:val="CE9178"/>
+          <w:sz w:val="16"/>
+          <w:szCs w:val="16"/>
+        </w:rPr>
+        <w:t>'q'</w:t>
+      </w:r>
+      <w:r>
+        <w:rPr>
+          <w:rFonts w:ascii="Consolas" w:hAnsi="Consolas"/>
+          <w:color w:val="CCCCCC"/>
+          <w:sz w:val="16"/>
+          <w:szCs w:val="16"/>
+        </w:rPr>
+        <w:t xml:space="preserve">) </w:t>
+      </w:r>
+      <w:r>
+        <w:rPr>
+          <w:rFonts w:ascii="Consolas" w:hAnsi="Consolas"/>
+          <w:color w:val="6A9955"/>
+          <w:sz w:val="16"/>
+          <w:szCs w:val="16"/>
+        </w:rPr>
+        <w:t xml:space="preserve">// q =&gt; pour </w:t>
+      </w:r>
+      <w:proofErr w:type="spellStart"/>
+      <w:r>
+        <w:rPr>
+          <w:rFonts w:ascii="Consolas" w:hAnsi="Consolas"/>
+          <w:color w:val="6A9955"/>
+          <w:sz w:val="16"/>
+          <w:szCs w:val="16"/>
+        </w:rPr>
+        <w:t>querry</w:t>
+      </w:r>
+      <w:proofErr w:type="spellEnd"/>
+      <w:r>
+        <w:rPr>
+          <w:rFonts w:ascii="Consolas" w:hAnsi="Consolas"/>
+          <w:color w:val="6A9955"/>
+          <w:sz w:val="16"/>
+          <w:szCs w:val="16"/>
+        </w:rPr>
+        <w:t>, se trouve dans l'url ex: GET /</w:t>
+      </w:r>
+      <w:proofErr w:type="spellStart"/>
+      <w:r>
+        <w:rPr>
+          <w:rFonts w:ascii="Consolas" w:hAnsi="Consolas"/>
+          <w:color w:val="6A9955"/>
+          <w:sz w:val="16"/>
+          <w:szCs w:val="16"/>
+        </w:rPr>
+        <w:t>books?q</w:t>
+      </w:r>
+      <w:proofErr w:type="spellEnd"/>
+      <w:r>
+        <w:rPr>
+          <w:rFonts w:ascii="Consolas" w:hAnsi="Consolas"/>
+          <w:color w:val="6A9955"/>
+          <w:sz w:val="16"/>
+          <w:szCs w:val="16"/>
+        </w:rPr>
+        <w:t>=aventure</w:t>
+      </w:r>
+    </w:p>
+    <w:p>
+      <w:pPr>
+        <w:pStyle w:val="Retraitcorpsdetexte"/>
+      </w:pPr>
+    </w:p>
+    <w:p>
+      <w:pPr>
+        <w:shd w:val="clear" w:color="auto" w:fill="1F1F1F"/>
+        <w:spacing w:line="285" w:lineRule="atLeast"/>
+        <w:rPr>
+          <w:rFonts w:ascii="Consolas" w:hAnsi="Consolas"/>
+          <w:color w:val="6A9955"/>
+          <w:sz w:val="16"/>
+          <w:szCs w:val="16"/>
+          <w:lang w:val="en-US"/>
+        </w:rPr>
+      </w:pPr>
+      <w:r>
+        <w:rPr>
+          <w:rFonts w:ascii="Consolas" w:hAnsi="Consolas"/>
+          <w:color w:val="CCCCCC"/>
+          <w:sz w:val="16"/>
+          <w:szCs w:val="16"/>
+          <w:lang w:val="en-US"/>
+        </w:rPr>
+        <w:t xml:space="preserve">        </w:t>
       </w:r>
       <w:proofErr w:type="spellStart"/>
       <w:proofErr w:type="gramStart"/>
       <w:r>
-        <w:t>compléter</w:t>
-      </w:r>
-      <w:r>
-        <w:t>,</w:t>
-      </w:r>
-      <w:r>
-        <w:t>par</w:t>
+        <w:rPr>
+          <w:rFonts w:ascii="Consolas" w:hAnsi="Consolas"/>
+          <w:color w:val="9CDCFE"/>
+          <w:sz w:val="16"/>
+          <w:szCs w:val="16"/>
+          <w:lang w:val="en-US"/>
+        </w:rPr>
+        <w:t>builder</w:t>
+      </w:r>
+      <w:r>
+        <w:rPr>
+          <w:rFonts w:ascii="Consolas" w:hAnsi="Consolas"/>
+          <w:color w:val="CCCCCC"/>
+          <w:sz w:val="16"/>
+          <w:szCs w:val="16"/>
+          <w:lang w:val="en-US"/>
+        </w:rPr>
+        <w:t>.</w:t>
+      </w:r>
+      <w:r>
+        <w:rPr>
+          <w:rFonts w:ascii="Consolas" w:hAnsi="Consolas"/>
+          <w:color w:val="DCDCAA"/>
+          <w:sz w:val="16"/>
+          <w:szCs w:val="16"/>
+          <w:lang w:val="en-US"/>
+        </w:rPr>
+        <w:t>whereILike</w:t>
       </w:r>
       <w:proofErr w:type="spellEnd"/>
       <w:proofErr w:type="gramEnd"/>
       <w:r>
-        <w:t xml:space="preserve"> une explication du contexte, de la situation, des raisons</w:t>
-      </w:r>
-      <w:r>
-        <w:t xml:space="preserve"> générales de la mise en route d’un tel projet. Le lecteur doit pouvoir comprendre les motivations du lancement du projet</w:t>
-      </w:r>
-      <w:r>
-        <w:t xml:space="preserve">… </w:t>
-      </w:r>
+        <w:rPr>
+          <w:rFonts w:ascii="Consolas" w:hAnsi="Consolas"/>
+          <w:color w:val="CCCCCC"/>
+          <w:sz w:val="16"/>
+          <w:szCs w:val="16"/>
+          <w:lang w:val="en-US"/>
+        </w:rPr>
+        <w:t>(</w:t>
+      </w:r>
+      <w:r>
+        <w:rPr>
+          <w:rFonts w:ascii="Consolas" w:hAnsi="Consolas"/>
+          <w:color w:val="CE9178"/>
+          <w:sz w:val="16"/>
+          <w:szCs w:val="16"/>
+          <w:lang w:val="en-US"/>
+        </w:rPr>
+        <w:t>‘</w:t>
+      </w:r>
+      <w:r>
+        <w:rPr>
+          <w:rFonts w:ascii="Consolas" w:hAnsi="Consolas"/>
+          <w:color w:val="CE9178"/>
+          <w:sz w:val="16"/>
+          <w:szCs w:val="16"/>
+          <w:lang w:val="en-US"/>
+        </w:rPr>
+        <w:t>title</w:t>
+      </w:r>
+      <w:r>
+        <w:rPr>
+          <w:rFonts w:ascii="Consolas" w:hAnsi="Consolas"/>
+          <w:color w:val="CE9178"/>
+          <w:sz w:val="16"/>
+          <w:szCs w:val="16"/>
+          <w:lang w:val="en-US"/>
+        </w:rPr>
+        <w:t>’</w:t>
+      </w:r>
+      <w:r>
+        <w:rPr>
+          <w:rFonts w:ascii="Consolas" w:hAnsi="Consolas"/>
+          <w:color w:val="CCCCCC"/>
+          <w:sz w:val="16"/>
+          <w:szCs w:val="16"/>
+          <w:lang w:val="en-US"/>
+        </w:rPr>
+        <w:t xml:space="preserve">, </w:t>
+      </w:r>
+      <w:r>
+        <w:rPr>
+          <w:rFonts w:ascii="Consolas" w:hAnsi="Consolas"/>
+          <w:color w:val="CE9178"/>
+          <w:sz w:val="16"/>
+          <w:szCs w:val="16"/>
+          <w:lang w:val="en-US"/>
+        </w:rPr>
+        <w:t>`%</w:t>
+      </w:r>
+      <w:r>
+        <w:rPr>
+          <w:rFonts w:ascii="Consolas" w:hAnsi="Consolas"/>
+          <w:color w:val="569CD6"/>
+          <w:sz w:val="16"/>
+          <w:szCs w:val="16"/>
+          <w:lang w:val="en-US"/>
+        </w:rPr>
+        <w:t>${</w:t>
+      </w:r>
+      <w:r>
+        <w:rPr>
+          <w:rFonts w:ascii="Consolas" w:hAnsi="Consolas"/>
+          <w:color w:val="4FC1FF"/>
+          <w:sz w:val="16"/>
+          <w:szCs w:val="16"/>
+          <w:lang w:val="en-US"/>
+        </w:rPr>
+        <w:t>q</w:t>
+      </w:r>
+      <w:r>
+        <w:rPr>
+          <w:rFonts w:ascii="Consolas" w:hAnsi="Consolas"/>
+          <w:color w:val="569CD6"/>
+          <w:sz w:val="16"/>
+          <w:szCs w:val="16"/>
+          <w:lang w:val="en-US"/>
+        </w:rPr>
+        <w:t>}</w:t>
+      </w:r>
+      <w:r>
+        <w:rPr>
+          <w:rFonts w:ascii="Consolas" w:hAnsi="Consolas"/>
+          <w:color w:val="CE9178"/>
+          <w:sz w:val="16"/>
+          <w:szCs w:val="16"/>
+          <w:lang w:val="en-US"/>
+        </w:rPr>
+        <w:t>%`</w:t>
+      </w:r>
+      <w:r>
+        <w:rPr>
+          <w:rFonts w:ascii="Consolas" w:hAnsi="Consolas"/>
+          <w:color w:val="CCCCCC"/>
+          <w:sz w:val="16"/>
+          <w:szCs w:val="16"/>
+          <w:lang w:val="en-US"/>
+        </w:rPr>
+        <w:t>).</w:t>
+      </w:r>
+      <w:proofErr w:type="spellStart"/>
+      <w:r>
+        <w:rPr>
+          <w:rFonts w:ascii="Consolas" w:hAnsi="Consolas"/>
+          <w:color w:val="DCDCAA"/>
+          <w:sz w:val="16"/>
+          <w:szCs w:val="16"/>
+          <w:lang w:val="en-US"/>
+        </w:rPr>
+        <w:t>orWhereILike</w:t>
+      </w:r>
+      <w:proofErr w:type="spellEnd"/>
+      <w:r>
+        <w:rPr>
+          <w:rFonts w:ascii="Consolas" w:hAnsi="Consolas"/>
+          <w:color w:val="CCCCCC"/>
+          <w:sz w:val="16"/>
+          <w:szCs w:val="16"/>
+          <w:lang w:val="en-US"/>
+        </w:rPr>
+        <w:t>(</w:t>
+      </w:r>
+      <w:r>
+        <w:rPr>
+          <w:rFonts w:ascii="Consolas" w:hAnsi="Consolas"/>
+          <w:color w:val="CE9178"/>
+          <w:sz w:val="16"/>
+          <w:szCs w:val="16"/>
+          <w:lang w:val="en-US"/>
+        </w:rPr>
+        <w:t>‘</w:t>
+      </w:r>
+      <w:r>
+        <w:rPr>
+          <w:rFonts w:ascii="Consolas" w:hAnsi="Consolas"/>
+          <w:color w:val="CE9178"/>
+          <w:sz w:val="16"/>
+          <w:szCs w:val="16"/>
+          <w:lang w:val="en-US"/>
+        </w:rPr>
+        <w:t>summary</w:t>
+      </w:r>
+      <w:r>
+        <w:rPr>
+          <w:rFonts w:ascii="Consolas" w:hAnsi="Consolas"/>
+          <w:color w:val="CE9178"/>
+          <w:sz w:val="16"/>
+          <w:szCs w:val="16"/>
+          <w:lang w:val="en-US"/>
+        </w:rPr>
+        <w:t>’</w:t>
+      </w:r>
+      <w:r>
+        <w:rPr>
+          <w:rFonts w:ascii="Consolas" w:hAnsi="Consolas"/>
+          <w:color w:val="CCCCCC"/>
+          <w:sz w:val="16"/>
+          <w:szCs w:val="16"/>
+          <w:lang w:val="en-US"/>
+        </w:rPr>
+        <w:t xml:space="preserve">, </w:t>
+      </w:r>
+      <w:r>
+        <w:rPr>
+          <w:rFonts w:ascii="Consolas" w:hAnsi="Consolas"/>
+          <w:color w:val="CE9178"/>
+          <w:sz w:val="16"/>
+          <w:szCs w:val="16"/>
+          <w:lang w:val="en-US"/>
+        </w:rPr>
+        <w:t>`%</w:t>
+      </w:r>
+      <w:r>
+        <w:rPr>
+          <w:rFonts w:ascii="Consolas" w:hAnsi="Consolas"/>
+          <w:color w:val="569CD6"/>
+          <w:sz w:val="16"/>
+          <w:szCs w:val="16"/>
+          <w:lang w:val="en-US"/>
+        </w:rPr>
+        <w:t>${</w:t>
+      </w:r>
+      <w:r>
+        <w:rPr>
+          <w:rFonts w:ascii="Consolas" w:hAnsi="Consolas"/>
+          <w:color w:val="4FC1FF"/>
+          <w:sz w:val="16"/>
+          <w:szCs w:val="16"/>
+          <w:lang w:val="en-US"/>
+        </w:rPr>
+        <w:t>q</w:t>
+      </w:r>
+      <w:r>
+        <w:rPr>
+          <w:rFonts w:ascii="Consolas" w:hAnsi="Consolas"/>
+          <w:color w:val="569CD6"/>
+          <w:sz w:val="16"/>
+          <w:szCs w:val="16"/>
+          <w:lang w:val="en-US"/>
+        </w:rPr>
+        <w:t>}</w:t>
+      </w:r>
+      <w:r>
+        <w:rPr>
+          <w:rFonts w:ascii="Consolas" w:hAnsi="Consolas"/>
+          <w:color w:val="CE9178"/>
+          <w:sz w:val="16"/>
+          <w:szCs w:val="16"/>
+          <w:lang w:val="en-US"/>
+        </w:rPr>
+        <w:t>%`</w:t>
+      </w:r>
+      <w:r>
+        <w:rPr>
+          <w:rFonts w:ascii="Consolas" w:hAnsi="Consolas"/>
+          <w:color w:val="CCCCCC"/>
+          <w:sz w:val="16"/>
+          <w:szCs w:val="16"/>
+          <w:lang w:val="en-US"/>
+        </w:rPr>
+        <w:t xml:space="preserve">) </w:t>
+      </w:r>
+      <w:r>
+        <w:rPr>
+          <w:rFonts w:ascii="Consolas" w:hAnsi="Consolas"/>
+          <w:color w:val="6A9955"/>
+          <w:sz w:val="16"/>
+          <w:szCs w:val="16"/>
+          <w:lang w:val="en-US"/>
+        </w:rPr>
+        <w:t xml:space="preserve">// </w:t>
+      </w:r>
+      <w:proofErr w:type="spellStart"/>
+      <w:r>
+        <w:rPr>
+          <w:rFonts w:ascii="Consolas" w:hAnsi="Consolas"/>
+          <w:color w:val="6A9955"/>
+          <w:sz w:val="16"/>
+          <w:szCs w:val="16"/>
+          <w:lang w:val="en-US"/>
+        </w:rPr>
+        <w:t>whereILike</w:t>
+      </w:r>
+      <w:proofErr w:type="spellEnd"/>
+      <w:r>
+        <w:rPr>
+          <w:rFonts w:ascii="Consolas" w:hAnsi="Consolas"/>
+          <w:color w:val="6A9955"/>
+          <w:sz w:val="16"/>
+          <w:szCs w:val="16"/>
+          <w:lang w:val="en-US"/>
+        </w:rPr>
+        <w:t xml:space="preserve"> ignore la case, % -&gt; pour les </w:t>
+      </w:r>
+      <w:proofErr w:type="spellStart"/>
+      <w:r>
+        <w:rPr>
+          <w:rFonts w:ascii="Consolas" w:hAnsi="Consolas"/>
+          <w:color w:val="6A9955"/>
+          <w:sz w:val="16"/>
+          <w:szCs w:val="16"/>
+          <w:lang w:val="en-US"/>
+        </w:rPr>
+        <w:t>caractères</w:t>
+      </w:r>
+      <w:proofErr w:type="spellEnd"/>
+      <w:r>
+        <w:rPr>
+          <w:rFonts w:ascii="Consolas" w:hAnsi="Consolas"/>
+          <w:color w:val="6A9955"/>
+          <w:sz w:val="16"/>
+          <w:szCs w:val="16"/>
+          <w:lang w:val="en-US"/>
+        </w:rPr>
+        <w:t xml:space="preserve"> jokers</w:t>
+      </w:r>
+    </w:p>
+    <w:p>
+      <w:pPr>
+        <w:pStyle w:val="Titre2"/>
+        <w:rPr>
+          <w:lang w:val="en-US"/>
+        </w:rPr>
+      </w:pPr>
+      <w:r>
+        <w:rPr>
+          <w:lang w:val="en-US"/>
+        </w:rPr>
+        <w:t xml:space="preserve">Système </w:t>
+      </w:r>
+      <w:proofErr w:type="spellStart"/>
+      <w:r>
+        <w:rPr>
+          <w:lang w:val="en-US"/>
+        </w:rPr>
+        <w:t>d’authentification</w:t>
+      </w:r>
+      <w:proofErr w:type="spellEnd"/>
+    </w:p>
+    <w:p>
+      <w:pPr>
+        <w:pStyle w:val="Retraitcorpsdetexte"/>
+        <w:rPr>
+          <w:lang w:val="en-US"/>
+        </w:rPr>
+      </w:pPr>
+    </w:p>
+    <w:p>
+      <w:pPr>
+        <w:pStyle w:val="Retraitcorpsdetexte"/>
+      </w:pPr>
+      <w:r>
+        <w:lastRenderedPageBreak/>
+        <w:t>Dans ce projet nous a</w:t>
+      </w:r>
+      <w:r>
+        <w:t xml:space="preserve">vons réalisé l’authentification à l’aide des </w:t>
+      </w:r>
+      <w:proofErr w:type="spellStart"/>
+      <w:r>
+        <w:t>tokens</w:t>
+      </w:r>
+      <w:proofErr w:type="spellEnd"/>
+      <w:r>
+        <w:t xml:space="preserve"> OAT</w:t>
+      </w:r>
+    </w:p>
+    <w:p>
+      <w:pPr>
+        <w:pStyle w:val="Retraitcorpsdetexte"/>
+      </w:pPr>
+      <w:r>
+        <w:t xml:space="preserve">(Opaque Access </w:t>
+      </w:r>
+      <w:proofErr w:type="spellStart"/>
+      <w:r>
+        <w:t>Tokens</w:t>
+      </w:r>
+      <w:proofErr w:type="spellEnd"/>
+      <w:r>
+        <w:t>)</w:t>
+      </w:r>
+      <w:r>
+        <w:t xml:space="preserve"> d’</w:t>
+      </w:r>
+      <w:proofErr w:type="spellStart"/>
+      <w:r>
+        <w:t>AdonisJS</w:t>
+      </w:r>
+      <w:proofErr w:type="spellEnd"/>
+      <w:r>
+        <w:t>, qui sont simples, traçables et bien sécurisés.</w:t>
+      </w:r>
+    </w:p>
+    <w:p>
+      <w:pPr>
+        <w:shd w:val="clear" w:color="auto" w:fill="1F1F1F"/>
+        <w:spacing w:line="285" w:lineRule="atLeast"/>
+        <w:rPr>
+          <w:rFonts w:ascii="Consolas" w:hAnsi="Consolas"/>
+          <w:color w:val="CCCCCC"/>
+          <w:sz w:val="16"/>
+          <w:szCs w:val="16"/>
+          <w:lang w:val="en-US"/>
+        </w:rPr>
+      </w:pPr>
+      <w:r>
+        <w:rPr>
+          <w:rFonts w:ascii="Consolas" w:hAnsi="Consolas"/>
+          <w:color w:val="CCCCCC"/>
+          <w:sz w:val="21"/>
+          <w:szCs w:val="21"/>
+        </w:rPr>
+        <w:t> </w:t>
+      </w:r>
+      <w:r>
+        <w:rPr>
+          <w:rFonts w:ascii="Consolas" w:hAnsi="Consolas"/>
+          <w:color w:val="CCCCCC"/>
+          <w:sz w:val="16"/>
+          <w:szCs w:val="16"/>
+        </w:rPr>
+        <w:t xml:space="preserve">   </w:t>
+      </w:r>
+      <w:r>
+        <w:rPr>
+          <w:rFonts w:ascii="Consolas" w:hAnsi="Consolas"/>
+          <w:color w:val="569CD6"/>
+          <w:sz w:val="16"/>
+          <w:szCs w:val="16"/>
+          <w:lang w:val="en-US"/>
+        </w:rPr>
+        <w:t>const</w:t>
+      </w:r>
+      <w:r>
+        <w:rPr>
+          <w:rFonts w:ascii="Consolas" w:hAnsi="Consolas"/>
+          <w:color w:val="CCCCCC"/>
+          <w:sz w:val="16"/>
+          <w:szCs w:val="16"/>
+          <w:lang w:val="en-US"/>
+        </w:rPr>
+        <w:t xml:space="preserve"> </w:t>
+      </w:r>
+      <w:r>
+        <w:rPr>
+          <w:rFonts w:ascii="Consolas" w:hAnsi="Consolas"/>
+          <w:color w:val="4FC1FF"/>
+          <w:sz w:val="16"/>
+          <w:szCs w:val="16"/>
+          <w:lang w:val="en-US"/>
+        </w:rPr>
+        <w:t>token</w:t>
+      </w:r>
+      <w:r>
+        <w:rPr>
+          <w:rFonts w:ascii="Consolas" w:hAnsi="Consolas"/>
+          <w:color w:val="CCCCCC"/>
+          <w:sz w:val="16"/>
+          <w:szCs w:val="16"/>
+          <w:lang w:val="en-US"/>
+        </w:rPr>
+        <w:t xml:space="preserve"> </w:t>
+      </w:r>
+      <w:r>
+        <w:rPr>
+          <w:rFonts w:ascii="Consolas" w:hAnsi="Consolas"/>
+          <w:color w:val="D4D4D4"/>
+          <w:sz w:val="16"/>
+          <w:szCs w:val="16"/>
+          <w:lang w:val="en-US"/>
+        </w:rPr>
+        <w:t>=</w:t>
+      </w:r>
+      <w:r>
+        <w:rPr>
+          <w:rFonts w:ascii="Consolas" w:hAnsi="Consolas"/>
+          <w:color w:val="CCCCCC"/>
+          <w:sz w:val="16"/>
+          <w:szCs w:val="16"/>
+          <w:lang w:val="en-US"/>
+        </w:rPr>
+        <w:t xml:space="preserve"> </w:t>
+      </w:r>
+      <w:r>
+        <w:rPr>
+          <w:rFonts w:ascii="Consolas" w:hAnsi="Consolas"/>
+          <w:color w:val="C586C0"/>
+          <w:sz w:val="16"/>
+          <w:szCs w:val="16"/>
+          <w:lang w:val="en-US"/>
+        </w:rPr>
+        <w:t>await</w:t>
+      </w:r>
+      <w:r>
+        <w:rPr>
+          <w:rFonts w:ascii="Consolas" w:hAnsi="Consolas"/>
+          <w:color w:val="CCCCCC"/>
+          <w:sz w:val="16"/>
+          <w:szCs w:val="16"/>
+          <w:lang w:val="en-US"/>
+        </w:rPr>
+        <w:t xml:space="preserve"> </w:t>
+      </w:r>
+      <w:proofErr w:type="spellStart"/>
+      <w:r>
+        <w:rPr>
+          <w:rFonts w:ascii="Consolas" w:hAnsi="Consolas"/>
+          <w:color w:val="9CDCFE"/>
+          <w:sz w:val="16"/>
+          <w:szCs w:val="16"/>
+          <w:lang w:val="en-US"/>
+        </w:rPr>
+        <w:t>auth</w:t>
+      </w:r>
+      <w:r>
+        <w:rPr>
+          <w:rFonts w:ascii="Consolas" w:hAnsi="Consolas"/>
+          <w:color w:val="CCCCCC"/>
+          <w:sz w:val="16"/>
+          <w:szCs w:val="16"/>
+          <w:lang w:val="en-US"/>
+        </w:rPr>
+        <w:t>.</w:t>
+      </w:r>
+      <w:r>
+        <w:rPr>
+          <w:rFonts w:ascii="Consolas" w:hAnsi="Consolas"/>
+          <w:color w:val="DCDCAA"/>
+          <w:sz w:val="16"/>
+          <w:szCs w:val="16"/>
+          <w:lang w:val="en-US"/>
+        </w:rPr>
+        <w:t>use</w:t>
+      </w:r>
+      <w:proofErr w:type="spellEnd"/>
+      <w:r>
+        <w:rPr>
+          <w:rFonts w:ascii="Consolas" w:hAnsi="Consolas"/>
+          <w:color w:val="CCCCCC"/>
+          <w:sz w:val="16"/>
+          <w:szCs w:val="16"/>
+          <w:lang w:val="en-US"/>
+        </w:rPr>
+        <w:t>(</w:t>
+      </w:r>
+      <w:r>
+        <w:rPr>
+          <w:rFonts w:ascii="Consolas" w:hAnsi="Consolas"/>
+          <w:color w:val="CE9178"/>
+          <w:sz w:val="16"/>
+          <w:szCs w:val="16"/>
+          <w:lang w:val="en-US"/>
+        </w:rPr>
+        <w:t>'</w:t>
+      </w:r>
+      <w:proofErr w:type="spellStart"/>
+      <w:r>
+        <w:rPr>
+          <w:rFonts w:ascii="Consolas" w:hAnsi="Consolas"/>
+          <w:color w:val="CE9178"/>
+          <w:sz w:val="16"/>
+          <w:szCs w:val="16"/>
+          <w:lang w:val="en-US"/>
+        </w:rPr>
+        <w:t>api</w:t>
+      </w:r>
+      <w:proofErr w:type="spellEnd"/>
+      <w:r>
+        <w:rPr>
+          <w:rFonts w:ascii="Consolas" w:hAnsi="Consolas"/>
+          <w:color w:val="CE9178"/>
+          <w:sz w:val="16"/>
+          <w:szCs w:val="16"/>
+          <w:lang w:val="en-US"/>
+        </w:rPr>
+        <w:t>'</w:t>
+      </w:r>
+      <w:proofErr w:type="gramStart"/>
+      <w:r>
+        <w:rPr>
+          <w:rFonts w:ascii="Consolas" w:hAnsi="Consolas"/>
+          <w:color w:val="CCCCCC"/>
+          <w:sz w:val="16"/>
+          <w:szCs w:val="16"/>
+          <w:lang w:val="en-US"/>
+        </w:rPr>
+        <w:t>).</w:t>
+      </w:r>
+      <w:proofErr w:type="spellStart"/>
+      <w:r>
+        <w:rPr>
+          <w:rFonts w:ascii="Consolas" w:hAnsi="Consolas"/>
+          <w:color w:val="DCDCAA"/>
+          <w:sz w:val="16"/>
+          <w:szCs w:val="16"/>
+          <w:lang w:val="en-US"/>
+        </w:rPr>
+        <w:t>createToken</w:t>
+      </w:r>
+      <w:proofErr w:type="spellEnd"/>
+      <w:proofErr w:type="gramEnd"/>
+      <w:r>
+        <w:rPr>
+          <w:rFonts w:ascii="Consolas" w:hAnsi="Consolas"/>
+          <w:color w:val="CCCCCC"/>
+          <w:sz w:val="16"/>
+          <w:szCs w:val="16"/>
+          <w:lang w:val="en-US"/>
+        </w:rPr>
+        <w:t>(</w:t>
+      </w:r>
+      <w:r>
+        <w:rPr>
+          <w:rFonts w:ascii="Consolas" w:hAnsi="Consolas"/>
+          <w:color w:val="9CDCFE"/>
+          <w:sz w:val="16"/>
+          <w:szCs w:val="16"/>
+          <w:lang w:val="en-US"/>
+        </w:rPr>
+        <w:t>user</w:t>
+      </w:r>
+      <w:r>
+        <w:rPr>
+          <w:rFonts w:ascii="Consolas" w:hAnsi="Consolas"/>
+          <w:color w:val="CCCCCC"/>
+          <w:sz w:val="16"/>
+          <w:szCs w:val="16"/>
+          <w:lang w:val="en-US"/>
+        </w:rPr>
+        <w:t xml:space="preserve">) </w:t>
+      </w:r>
+    </w:p>
+    <w:p>
+      <w:pPr>
+        <w:pStyle w:val="Retraitcorpsdetexte"/>
+        <w:rPr>
+          <w:lang w:val="en-US"/>
+        </w:rPr>
+      </w:pPr>
+    </w:p>
+    <w:p>
+      <w:pPr>
+        <w:pStyle w:val="Titre2"/>
+        <w:rPr>
+          <w:lang w:val="en-US"/>
+        </w:rPr>
+      </w:pPr>
+      <w:r>
+        <w:rPr>
+          <w:lang w:val="en-US"/>
+        </w:rPr>
+        <w:t>Swagger</w:t>
+      </w:r>
+    </w:p>
+    <w:p>
+      <w:pPr>
+        <w:pStyle w:val="Retraitcorpsdetexte"/>
+      </w:pPr>
+      <w:r>
+        <w:t xml:space="preserve">Nous ajouté au projet </w:t>
+      </w:r>
+      <w:r>
+        <w:t xml:space="preserve">la documentation d’API </w:t>
+      </w:r>
+      <w:proofErr w:type="spellStart"/>
+      <w:r>
+        <w:t>Swagger</w:t>
+      </w:r>
+      <w:proofErr w:type="spellEnd"/>
+      <w:r>
+        <w:t>, qui permet d’accéder aux routes du projet.</w:t>
+      </w:r>
+    </w:p>
+    <w:p>
+      <w:pPr>
+        <w:pStyle w:val="Retraitcorpsdetexte"/>
+        <w:ind w:left="2124"/>
+      </w:pPr>
+      <w:r>
+        <w:tab/>
+      </w:r>
+      <w:r>
+        <w:drawing>
+          <wp:inline distT="0" distB="0" distL="0" distR="0" wp14:anchorId="485FC1B7" wp14:editId="74DA993B">
+            <wp:extent cx="3343701" cy="1061806"/>
+            <wp:effectExtent l="0" t="0" r="9525" b="5080"/>
+            <wp:docPr id="1605210515" name="Image 1"/>
+            <wp:cNvGraphicFramePr>
+              <a:graphicFrameLocks xmlns:a="http://schemas.openxmlformats.org/drawingml/2006/main" noChangeAspect="1"/>
+            </wp:cNvGraphicFramePr>
+            <a:graphic xmlns:a="http://schemas.openxmlformats.org/drawingml/2006/main">
+              <a:graphicData uri="http://schemas.openxmlformats.org/drawingml/2006/picture">
+                <pic:pic xmlns:pic="http://schemas.openxmlformats.org/drawingml/2006/picture">
+                  <pic:nvPicPr>
+                    <pic:cNvPr id="1605210515" name=""/>
+                    <pic:cNvPicPr/>
+                  </pic:nvPicPr>
+                  <pic:blipFill>
+                    <a:blip r:embed="rId15"/>
+                    <a:stretch>
+                      <a:fillRect/>
+                    </a:stretch>
+                  </pic:blipFill>
+                  <pic:spPr>
+                    <a:xfrm>
+                      <a:off x="0" y="0"/>
+                      <a:ext cx="3351509" cy="1064285"/>
+                    </a:xfrm>
+                    <a:prstGeom prst="rect">
+                      <a:avLst/>
+                    </a:prstGeom>
+                  </pic:spPr>
+                </pic:pic>
+              </a:graphicData>
+            </a:graphic>
+          </wp:inline>
+        </w:drawing>
+      </w:r>
+    </w:p>
+    <w:p>
+      <w:pPr>
+        <w:pStyle w:val="Retraitcorpsdetexte"/>
+      </w:pPr>
+    </w:p>
+    <w:p>
+      <w:pPr>
+        <w:pStyle w:val="Titre2"/>
+      </w:pPr>
+      <w:r>
+        <w:t>Tests d’API</w:t>
+      </w:r>
+    </w:p>
+    <w:p>
+      <w:pPr>
+        <w:pStyle w:val="Retraitcorpsdetexte"/>
+      </w:pPr>
+      <w:r>
+        <w:t xml:space="preserve">Pour tester le fonctionnement d’API nous avons utilisé logiciel de tests Bruno, où nous avons créé les routes pour tout tester. Pour tester la partie où l’authentification est nécessaire, il faut d’abord s’identifier (par la requête login), puis sauvegarder le </w:t>
+      </w:r>
+      <w:proofErr w:type="spellStart"/>
+      <w:r>
+        <w:t>token</w:t>
+      </w:r>
+      <w:proofErr w:type="spellEnd"/>
+      <w:r>
+        <w:t xml:space="preserve"> dans une variable dans Bruno à l’aide de ce script :</w:t>
+      </w:r>
+    </w:p>
+    <w:p>
+      <w:pPr>
+        <w:pStyle w:val="Retraitcorpsdetexte"/>
+        <w:ind w:left="1416"/>
+      </w:pPr>
+      <w:r>
+        <w:tab/>
+      </w:r>
+      <w:r>
+        <w:tab/>
+        <w:t xml:space="preserve"> </w:t>
+      </w:r>
+      <w:r>
+        <w:drawing>
+          <wp:inline distT="0" distB="0" distL="0" distR="0" wp14:anchorId="60D34931" wp14:editId="7A937B72">
+            <wp:extent cx="3630304" cy="1081199"/>
+            <wp:effectExtent l="190500" t="190500" r="179705" b="195580"/>
+            <wp:docPr id="327590555" name="Image 1"/>
+            <wp:cNvGraphicFramePr>
+              <a:graphicFrameLocks xmlns:a="http://schemas.openxmlformats.org/drawingml/2006/main" noChangeAspect="1"/>
+            </wp:cNvGraphicFramePr>
+            <a:graphic xmlns:a="http://schemas.openxmlformats.org/drawingml/2006/main">
+              <a:graphicData uri="http://schemas.openxmlformats.org/drawingml/2006/picture">
+                <pic:pic xmlns:pic="http://schemas.openxmlformats.org/drawingml/2006/picture">
+                  <pic:nvPicPr>
+                    <pic:cNvPr id="327590555" name=""/>
+                    <pic:cNvPicPr/>
+                  </pic:nvPicPr>
+                  <pic:blipFill>
+                    <a:blip r:embed="rId16"/>
+                    <a:stretch>
+                      <a:fillRect/>
+                    </a:stretch>
+                  </pic:blipFill>
+                  <pic:spPr>
+                    <a:xfrm>
+                      <a:off x="0" y="0"/>
+                      <a:ext cx="3641184" cy="1084439"/>
+                    </a:xfrm>
+                    <a:prstGeom prst="rect">
+                      <a:avLst/>
+                    </a:prstGeom>
+                    <a:ln>
+                      <a:noFill/>
+                    </a:ln>
+                    <a:effectLst>
+                      <a:outerShdw blurRad="190500" algn="tl" rotWithShape="0">
+                        <a:srgbClr val="000000">
+                          <a:alpha val="70000"/>
+                        </a:srgbClr>
+                      </a:outerShdw>
+                    </a:effectLst>
+                  </pic:spPr>
+                </pic:pic>
+              </a:graphicData>
+            </a:graphic>
+          </wp:inline>
+        </w:drawing>
+      </w:r>
+    </w:p>
+    <w:p>
+      <w:pPr>
+        <w:pStyle w:val="Retraitcorpsdetexte"/>
+      </w:pPr>
+      <w:r>
+        <w:t>Ensuite on met la variable « {{</w:t>
+      </w:r>
+      <w:proofErr w:type="spellStart"/>
+      <w:r>
+        <w:t>api_token</w:t>
+      </w:r>
+      <w:proofErr w:type="spellEnd"/>
+      <w:r>
+        <w:t xml:space="preserve">}} » dans l’onglet </w:t>
+      </w:r>
+      <w:proofErr w:type="spellStart"/>
+      <w:r>
+        <w:t>Auth</w:t>
+      </w:r>
+      <w:proofErr w:type="spellEnd"/>
+      <w:r>
+        <w:t xml:space="preserve"> en Bruno dans une requête qui demande l’authentification (par exemple la création de livre), et maintenant nous pouvons l’exécuter correctement.</w:t>
+      </w:r>
+    </w:p>
+    <w:p>
+      <w:r>
+        <w:br w:type="page"/>
+      </w:r>
+    </w:p>
+    <w:p>
+      <w:pPr>
+        <w:pStyle w:val="Titre2"/>
+      </w:pPr>
+      <w:r>
+        <w:lastRenderedPageBreak/>
+        <w:t>CORS</w:t>
+      </w:r>
+    </w:p>
+    <w:p>
+      <w:pPr>
+        <w:pStyle w:val="Retraitcorpsdetexte"/>
+      </w:pPr>
+      <w:r>
+        <w:t>Le système CORS qui permet de contrôler qui a la possibilité d’appeler l’API depuis le navigateur. Nous avons mis le lien de frontend (localhost :5173) et nous avons laissé le lien de backend pour les tests</w:t>
+      </w:r>
+    </w:p>
+    <w:p>
+      <w:pPr>
+        <w:pStyle w:val="Retraitcorpsdetexte"/>
+      </w:pPr>
+    </w:p>
+    <w:p>
+      <w:pPr>
+        <w:pStyle w:val="Retraitcorpsdetexte"/>
+        <w:ind w:left="2124"/>
+      </w:pPr>
+      <w:r>
+        <w:drawing>
+          <wp:inline distT="0" distB="0" distL="0" distR="0" wp14:anchorId="580A9415" wp14:editId="11314AB9">
+            <wp:extent cx="2896381" cy="2040340"/>
+            <wp:effectExtent l="0" t="0" r="0" b="0"/>
+            <wp:docPr id="961460214" name="Image 1"/>
+            <wp:cNvGraphicFramePr>
+              <a:graphicFrameLocks xmlns:a="http://schemas.openxmlformats.org/drawingml/2006/main" noChangeAspect="1"/>
+            </wp:cNvGraphicFramePr>
+            <a:graphic xmlns:a="http://schemas.openxmlformats.org/drawingml/2006/main">
+              <a:graphicData uri="http://schemas.openxmlformats.org/drawingml/2006/picture">
+                <pic:pic xmlns:pic="http://schemas.openxmlformats.org/drawingml/2006/picture">
+                  <pic:nvPicPr>
+                    <pic:cNvPr id="961460214" name=""/>
+                    <pic:cNvPicPr/>
+                  </pic:nvPicPr>
+                  <pic:blipFill>
+                    <a:blip r:embed="rId17"/>
+                    <a:stretch>
+                      <a:fillRect/>
+                    </a:stretch>
+                  </pic:blipFill>
+                  <pic:spPr>
+                    <a:xfrm>
+                      <a:off x="0" y="0"/>
+                      <a:ext cx="2899773" cy="2042730"/>
+                    </a:xfrm>
+                    <a:prstGeom prst="rect">
+                      <a:avLst/>
+                    </a:prstGeom>
+                  </pic:spPr>
+                </pic:pic>
+              </a:graphicData>
+            </a:graphic>
+          </wp:inline>
+        </w:drawing>
+      </w:r>
+    </w:p>
+    <w:p>
+      <w:pPr>
+        <w:pStyle w:val="Retraitcorpsdetexte"/>
+      </w:pPr>
+    </w:p>
+    <w:p>
+      <w:pPr>
+        <w:pStyle w:val="Retraitcorpsdetexte"/>
+      </w:pPr>
     </w:p>
     <w:p>
       <w:pPr>
         <w:pStyle w:val="Titre1"/>
       </w:pPr>
-      <w:bookmarkStart w:id="7" w:name="_Toc71040026"/>
-      <w:r>
-        <w:t>Planification</w:t>
-      </w:r>
-      <w:bookmarkEnd w:id="4"/>
-      <w:bookmarkEnd w:id="5"/>
-      <w:r>
-        <w:t>/Gestion projet</w:t>
-      </w:r>
-      <w:bookmarkEnd w:id="7"/>
-    </w:p>
-    <w:p>
-      <w:pPr>
-        <w:pStyle w:val="Informations"/>
-        <w:numPr>
-          <w:ilvl w:val="5"/>
-          <w:numId w:val="26"/>
-        </w:numPr>
-      </w:pPr>
-      <w:r>
-        <w:t xml:space="preserve">Infos sur l’organisation Agile, lien Trello/Git, infos sur </w:t>
+      <w:bookmarkStart w:id="9" w:name="_Toc532179966"/>
+      <w:bookmarkStart w:id="10" w:name="_Toc165969650"/>
+      <w:bookmarkStart w:id="11" w:name="_Toc71040030"/>
+      <w:r>
+        <w:t>Tests</w:t>
+      </w:r>
+      <w:bookmarkEnd w:id="9"/>
+      <w:bookmarkEnd w:id="10"/>
+      <w:bookmarkEnd w:id="11"/>
+    </w:p>
+    <w:p>
+      <w:pPr>
+        <w:pStyle w:val="Titre2"/>
+      </w:pPr>
+      <w:bookmarkStart w:id="12" w:name="_Toc71040031"/>
+      <w:bookmarkStart w:id="13" w:name="_Toc532179968"/>
+      <w:bookmarkStart w:id="14" w:name="_Toc165969652"/>
+      <w:bookmarkStart w:id="15" w:name="_Ref308525868"/>
+      <w:r>
+        <w:t xml:space="preserve">Points techniques évalués du </w:t>
       </w:r>
       <w:proofErr w:type="spellStart"/>
       <w:r>
-        <w:t>jdt</w:t>
-      </w:r>
-      <w:proofErr w:type="spellEnd"/>
-      <w:r>
-        <w:t xml:space="preserve"> du groupe ou individuel</w:t>
-      </w:r>
-    </w:p>
-    <w:p>
-      <w:pPr>
-        <w:pStyle w:val="Titre1"/>
-      </w:pPr>
-      <w:bookmarkStart w:id="8" w:name="_Toc71040027"/>
-      <w:r>
-        <w:t>Points techniques</w:t>
-      </w:r>
-      <w:bookmarkEnd w:id="8"/>
-    </w:p>
-    <w:p>
-      <w:pPr>
-        <w:pStyle w:val="Titre2"/>
-      </w:pPr>
-      <w:bookmarkStart w:id="9" w:name="_Toc71040028"/>
-      <w:r>
-        <w:t xml:space="preserve">Premier </w:t>
-      </w:r>
-      <w:r>
-        <w:t>point</w:t>
-      </w:r>
-      <w:bookmarkEnd w:id="9"/>
-    </w:p>
-    <w:p>
-      <w:pPr>
-        <w:pStyle w:val="Informations"/>
-        <w:numPr>
-          <w:ilvl w:val="5"/>
-          <w:numId w:val="16"/>
-        </w:numPr>
-      </w:pPr>
-      <w:r>
-        <w:t>Explicati</w:t>
-      </w:r>
-      <w:r>
-        <w:t>ons détaillées du premier point technique</w:t>
-      </w:r>
-    </w:p>
-    <w:p>
-      <w:pPr>
-        <w:pStyle w:val="Titre2"/>
-      </w:pPr>
-      <w:bookmarkStart w:id="10" w:name="_Toc71040029"/>
-      <w:r>
-        <w:t>Deuxième point</w:t>
-      </w:r>
-      <w:bookmarkEnd w:id="10"/>
-    </w:p>
-    <w:p>
-      <w:pPr>
-        <w:pStyle w:val="Informations"/>
-        <w:numPr>
-          <w:ilvl w:val="5"/>
-          <w:numId w:val="17"/>
-        </w:numPr>
-      </w:pPr>
-      <w:r>
-        <w:t>Explications détaillées du 2</w:t>
-      </w:r>
-      <w:r>
-        <w:rPr>
-          <w:vertAlign w:val="superscript"/>
-        </w:rPr>
-        <w:t>e</w:t>
-      </w:r>
-      <w:r>
-        <w:t xml:space="preserve"> point</w:t>
-      </w:r>
-    </w:p>
-    <w:p>
-      <w:pPr>
-        <w:pStyle w:val="Titre1"/>
-      </w:pPr>
-      <w:bookmarkStart w:id="11" w:name="_Toc532179966"/>
-      <w:bookmarkStart w:id="12" w:name="_Toc165969650"/>
-      <w:bookmarkStart w:id="13" w:name="_Toc71040030"/>
-      <w:r>
-        <w:t>Tests</w:t>
-      </w:r>
-      <w:bookmarkEnd w:id="11"/>
+        <w:t>CdC</w:t>
+      </w:r>
       <w:bookmarkEnd w:id="12"/>
-      <w:bookmarkEnd w:id="13"/>
-    </w:p>
-    <w:p>
-      <w:pPr>
-        <w:pStyle w:val="Titre2"/>
-      </w:pPr>
-      <w:bookmarkStart w:id="14" w:name="_Toc71040031"/>
-      <w:bookmarkStart w:id="15" w:name="_Toc532179968"/>
-      <w:bookmarkStart w:id="16" w:name="_Toc165969652"/>
-      <w:bookmarkStart w:id="17" w:name="_Ref308525868"/>
-      <w:r>
-        <w:t xml:space="preserve">Points techniques évalués du </w:t>
-      </w:r>
-      <w:proofErr w:type="spellStart"/>
-      <w:r>
-        <w:t>CdC</w:t>
-      </w:r>
-      <w:bookmarkEnd w:id="14"/>
       <w:proofErr w:type="spellEnd"/>
     </w:p>
     <w:p>
@@ -2305,11 +3963,11 @@
       <w:pPr>
         <w:pStyle w:val="Titre2"/>
       </w:pPr>
-      <w:bookmarkStart w:id="18" w:name="_Toc71040032"/>
+      <w:bookmarkStart w:id="16" w:name="_Toc71040032"/>
       <w:r>
         <w:t>Exemples de lancement des scripts</w:t>
       </w:r>
-      <w:bookmarkEnd w:id="18"/>
+      <w:bookmarkEnd w:id="16"/>
     </w:p>
     <w:p>
       <w:pPr>
@@ -2327,17 +3985,17 @@
       <w:pPr>
         <w:pStyle w:val="Titre2"/>
       </w:pPr>
-      <w:bookmarkStart w:id="19" w:name="_Toc71040033"/>
+      <w:bookmarkStart w:id="17" w:name="_Toc71040033"/>
       <w:r>
         <w:t>Tableau</w:t>
       </w:r>
       <w:r>
         <w:t xml:space="preserve"> des tests</w:t>
       </w:r>
+      <w:bookmarkEnd w:id="13"/>
+      <w:bookmarkEnd w:id="14"/>
       <w:bookmarkEnd w:id="15"/>
-      <w:bookmarkEnd w:id="16"/>
       <w:bookmarkEnd w:id="17"/>
-      <w:bookmarkEnd w:id="19"/>
     </w:p>
     <w:p>
       <w:pPr>
@@ -2355,7 +4013,7 @@
       <w:pPr>
         <w:pStyle w:val="Titre2"/>
       </w:pPr>
-      <w:bookmarkStart w:id="20" w:name="_Toc71040034"/>
+      <w:bookmarkStart w:id="18" w:name="_Toc71040034"/>
       <w:r>
         <w:t>Validation client 1</w:t>
       </w:r>
@@ -2368,7 +4026,7 @@
       <w:r>
         <w:t xml:space="preserve"> sprint</w:t>
       </w:r>
-      <w:bookmarkEnd w:id="20"/>
+      <w:bookmarkEnd w:id="18"/>
     </w:p>
     <w:p>
       <w:pPr>
@@ -2392,28 +4050,28 @@
       <w:pPr>
         <w:pStyle w:val="Titre1"/>
       </w:pPr>
-      <w:bookmarkStart w:id="21" w:name="_Toc165969653"/>
-      <w:bookmarkStart w:id="22" w:name="_Toc71040035"/>
+      <w:bookmarkStart w:id="19" w:name="_Toc165969653"/>
+      <w:bookmarkStart w:id="20" w:name="_Toc71040035"/>
       <w:r>
         <w:t>Conclusion</w:t>
       </w:r>
+      <w:bookmarkEnd w:id="19"/>
+      <w:bookmarkEnd w:id="20"/>
+    </w:p>
+    <w:p>
+      <w:pPr>
+        <w:pStyle w:val="Titre2"/>
+      </w:pPr>
+      <w:bookmarkStart w:id="21" w:name="_Toc165969654"/>
+      <w:bookmarkStart w:id="22" w:name="_Toc71040036"/>
+      <w:r>
+        <w:t xml:space="preserve">Bilan des </w:t>
+      </w:r>
       <w:bookmarkEnd w:id="21"/>
+      <w:r>
+        <w:t>fonctionnalités demandées</w:t>
+      </w:r>
       <w:bookmarkEnd w:id="22"/>
-    </w:p>
-    <w:p>
-      <w:pPr>
-        <w:pStyle w:val="Titre2"/>
-      </w:pPr>
-      <w:bookmarkStart w:id="23" w:name="_Toc165969654"/>
-      <w:bookmarkStart w:id="24" w:name="_Toc71040036"/>
-      <w:r>
-        <w:t xml:space="preserve">Bilan des </w:t>
-      </w:r>
-      <w:bookmarkEnd w:id="23"/>
-      <w:r>
-        <w:t>fonctionnalités demandées</w:t>
-      </w:r>
-      <w:bookmarkEnd w:id="24"/>
     </w:p>
     <w:p>
       <w:pPr>
@@ -2452,13 +4110,13 @@
       <w:pPr>
         <w:pStyle w:val="Titre2"/>
       </w:pPr>
-      <w:bookmarkStart w:id="25" w:name="_Toc165969655"/>
-      <w:bookmarkStart w:id="26" w:name="_Toc71040037"/>
+      <w:bookmarkStart w:id="23" w:name="_Toc165969655"/>
+      <w:bookmarkStart w:id="24" w:name="_Toc71040037"/>
       <w:r>
         <w:t>Bilan de la planification</w:t>
       </w:r>
-      <w:bookmarkEnd w:id="25"/>
-      <w:bookmarkEnd w:id="26"/>
+      <w:bookmarkEnd w:id="23"/>
+      <w:bookmarkEnd w:id="24"/>
     </w:p>
     <w:p>
       <w:pPr>
@@ -2496,15 +4154,15 @@
       <w:pPr>
         <w:pStyle w:val="Titre2"/>
       </w:pPr>
-      <w:bookmarkStart w:id="27" w:name="_Toc71040038"/>
-      <w:bookmarkStart w:id="28" w:name="_Toc165969656"/>
+      <w:bookmarkStart w:id="25" w:name="_Toc71040038"/>
+      <w:bookmarkStart w:id="26" w:name="_Toc165969656"/>
       <w:r>
         <w:t>Bilan personnel</w:t>
       </w:r>
       <w:r>
         <w:t xml:space="preserve"> nom du membre du groupe</w:t>
       </w:r>
-      <w:bookmarkEnd w:id="27"/>
+      <w:bookmarkEnd w:id="25"/>
     </w:p>
     <w:p>
       <w:pPr>
@@ -2592,7 +4250,7 @@
       <w:pPr>
         <w:pStyle w:val="Titre2"/>
       </w:pPr>
-      <w:bookmarkStart w:id="29" w:name="_Toc71040039"/>
+      <w:bookmarkStart w:id="27" w:name="_Toc71040039"/>
       <w:r>
         <w:lastRenderedPageBreak/>
         <w:t>Bilan personnel</w:t>
@@ -2600,7 +4258,7 @@
       <w:r>
         <w:t xml:space="preserve"> nom du membre du groupe</w:t>
       </w:r>
-      <w:bookmarkEnd w:id="29"/>
+      <w:bookmarkEnd w:id="27"/>
     </w:p>
     <w:p>
       <w:pPr>
@@ -2688,15 +4346,15 @@
       <w:pPr>
         <w:pStyle w:val="Titre2"/>
       </w:pPr>
-      <w:bookmarkStart w:id="30" w:name="_Toc71040040"/>
+      <w:bookmarkStart w:id="28" w:name="_Toc71040040"/>
       <w:r>
         <w:t>Bilan personnel</w:t>
       </w:r>
+      <w:bookmarkEnd w:id="26"/>
+      <w:r>
+        <w:t xml:space="preserve"> nom du membre du groupe</w:t>
+      </w:r>
       <w:bookmarkEnd w:id="28"/>
-      <w:r>
-        <w:t xml:space="preserve"> nom du membre du groupe</w:t>
-      </w:r>
-      <w:bookmarkEnd w:id="30"/>
     </w:p>
     <w:p>
       <w:pPr>
@@ -2808,25 +4466,25 @@
       <w:pPr>
         <w:pStyle w:val="Titre1"/>
       </w:pPr>
-      <w:bookmarkStart w:id="31" w:name="_Toc532179971"/>
-      <w:bookmarkStart w:id="32" w:name="_Toc165969657"/>
-      <w:bookmarkStart w:id="33" w:name="_Toc71040041"/>
+      <w:bookmarkStart w:id="29" w:name="_Toc532179971"/>
+      <w:bookmarkStart w:id="30" w:name="_Toc165969657"/>
+      <w:bookmarkStart w:id="31" w:name="_Toc71040041"/>
       <w:r>
         <w:t>Divers</w:t>
       </w:r>
+      <w:bookmarkEnd w:id="29"/>
+      <w:bookmarkEnd w:id="30"/>
       <w:bookmarkEnd w:id="31"/>
+    </w:p>
+    <w:p>
+      <w:pPr>
+        <w:pStyle w:val="Titre2"/>
+      </w:pPr>
+      <w:bookmarkStart w:id="32" w:name="_Toc71040042"/>
+      <w:r>
+        <w:t>Webographie</w:t>
+      </w:r>
       <w:bookmarkEnd w:id="32"/>
-      <w:bookmarkEnd w:id="33"/>
-    </w:p>
-    <w:p>
-      <w:pPr>
-        <w:pStyle w:val="Titre2"/>
-      </w:pPr>
-      <w:bookmarkStart w:id="34" w:name="_Toc71040042"/>
-      <w:r>
-        <w:t>Webographie</w:t>
-      </w:r>
-      <w:bookmarkEnd w:id="34"/>
     </w:p>
     <w:p>
       <w:pPr>
@@ -2841,8 +4499,8 @@
       </w:r>
     </w:p>
     <w:sectPr>
-      <w:headerReference w:type="default" r:id="rId12"/>
-      <w:footerReference w:type="default" r:id="rId13"/>
+      <w:headerReference w:type="default" r:id="rId18"/>
+      <w:footerReference w:type="default" r:id="rId19"/>
       <w:pgSz w:w="11906" w:h="16838" w:code="9"/>
       <w:pgMar w:top="1418" w:right="1418" w:bottom="1418" w:left="1418" w:header="709" w:footer="709" w:gutter="0"/>
       <w:cols w:space="708"/>
@@ -2854,7 +4512,7 @@
 </file>
 
 <file path=word/endnotes.xml><?xml version="1.0" encoding="utf-8"?>
-<w:endnotes xmlns:wpc="http://schemas.microsoft.com/office/word/2010/wordprocessingCanvas" xmlns:cx="http://schemas.microsoft.com/office/drawing/2014/chartex" xmlns:cx1="http://schemas.microsoft.com/office/drawing/2015/9/8/chartex" xmlns:cx2="http://schemas.microsoft.com/office/drawing/2015/10/21/chartex" xmlns:cx3="http://schemas.microsoft.com/office/drawing/2016/5/9/chartex" xmlns:cx4="http://schemas.microsoft.com/office/drawing/2016/5/10/chartex" xmlns:cx5="http://schemas.microsoft.com/office/drawing/2016/5/11/chartex" xmlns:cx6="http://schemas.microsoft.com/office/drawing/2016/5/12/chartex" xmlns:cx7="http://schemas.microsoft.com/office/drawing/2016/5/13/chartex" xmlns:cx8="http://schemas.microsoft.com/office/drawing/2016/5/14/chartex" xmlns:mc="http://schemas.openxmlformats.org/markup-compatibility/2006" xmlns:aink="http://schemas.microsoft.com/office/drawing/2016/ink" xmlns:am3d="http://schemas.microsoft.com/office/drawing/2017/model3d" xmlns:o="urn:schemas-microsoft-com:office:office" xmlns:oel="http://schemas.microsoft.com/office/2019/extlst" xmlns:r="http://schemas.openxmlformats.org/officeDocument/2006/relationships" xmlns:m="http://schemas.openxmlformats.org/officeDocument/2006/math" xmlns:v="urn:schemas-microsoft-com:vml" xmlns:wp14="http://schemas.microsoft.com/office/word/2010/wordprocessingDrawing" xmlns:wp="http://schemas.openxmlformats.org/drawingml/2006/wordprocessingDrawing" xmlns:w10="urn:schemas-microsoft-com:office:word" xmlns:w="http://schemas.openxmlformats.org/wordprocessingml/2006/main" xmlns:w14="http://schemas.microsoft.com/office/word/2010/wordml" xmlns:w15="http://schemas.microsoft.com/office/word/2012/wordml" xmlns:w16cex="http://schemas.microsoft.com/office/word/2018/wordml/cex" xmlns:w16cid="http://schemas.microsoft.com/office/word/2016/wordml/cid" xmlns:w16="http://schemas.microsoft.com/office/word/2018/wordml" xmlns:w16du="http://schemas.microsoft.com/office/word/2023/wordml/word16du" xmlns:w16sdtdh="http://schemas.microsoft.com/office/word/2020/wordml/sdtdatahash" xmlns:w16sdtfl="http://schemas.microsoft.com/office/word/2024/wordml/sdtformatlock" xmlns:w16se="http://schemas.microsoft.com/office/word/2015/wordml/symex" xmlns:wpg="http://schemas.microsoft.com/office/word/2010/wordprocessingGroup" xmlns:wpi="http://schemas.microsoft.com/office/word/2010/wordprocessingInk" xmlns:wne="http://schemas.microsoft.com/office/word/2006/wordml" xmlns:wps="http://schemas.microsoft.com/office/word/2010/wordprocessingShape" mc:Ignorable="w14 w15 w16se w16cid w16 w16cex w16sdtdh w16sdtfl w16du wp14">
+<w:endnotes xmlns:wpc="http://schemas.microsoft.com/office/word/2010/wordprocessingCanvas" xmlns:cx="http://schemas.microsoft.com/office/drawing/2014/chartex" xmlns:cx1="http://schemas.microsoft.com/office/drawing/2015/9/8/chartex" xmlns:cx2="http://schemas.microsoft.com/office/drawing/2015/10/21/chartex" xmlns:cx3="http://schemas.microsoft.com/office/drawing/2016/5/9/chartex" xmlns:cx4="http://schemas.microsoft.com/office/drawing/2016/5/10/chartex" xmlns:cx5="http://schemas.microsoft.com/office/drawing/2016/5/11/chartex" xmlns:cx6="http://schemas.microsoft.com/office/drawing/2016/5/12/chartex" xmlns:cx7="http://schemas.microsoft.com/office/drawing/2016/5/13/chartex" xmlns:cx8="http://schemas.microsoft.com/office/drawing/2016/5/14/chartex" xmlns:mc="http://schemas.openxmlformats.org/markup-compatibility/2006" xmlns:aink="http://schemas.microsoft.com/office/drawing/2016/ink" xmlns:am3d="http://schemas.microsoft.com/office/drawing/2017/model3d" xmlns:o="urn:schemas-microsoft-com:office:office" xmlns:oel="http://schemas.microsoft.com/office/2019/extlst" xmlns:r="http://schemas.openxmlformats.org/officeDocument/2006/relationships" xmlns:m="http://schemas.openxmlformats.org/officeDocument/2006/math" xmlns:v="urn:schemas-microsoft-com:vml" xmlns:wp14="http://schemas.microsoft.com/office/word/2010/wordprocessingDrawing" xmlns:wp="http://schemas.openxmlformats.org/drawingml/2006/wordprocessingDrawing" xmlns:w10="urn:schemas-microsoft-com:office:word" xmlns:w="http://schemas.openxmlformats.org/wordprocessingml/2006/main" xmlns:w14="http://schemas.microsoft.com/office/word/2010/wordml" xmlns:w15="http://schemas.microsoft.com/office/word/2012/wordml" xmlns:w16cex="http://schemas.microsoft.com/office/word/2018/wordml/cex" xmlns:w16cid="http://schemas.microsoft.com/office/word/2016/wordml/cid" xmlns:w16="http://schemas.microsoft.com/office/word/2018/wordml" xmlns:w16sdtdh="http://schemas.microsoft.com/office/word/2020/wordml/sdtdatahash" xmlns:w16se="http://schemas.microsoft.com/office/word/2015/wordml/symex" xmlns:wpg="http://schemas.microsoft.com/office/word/2010/wordprocessingGroup" xmlns:wpi="http://schemas.microsoft.com/office/word/2010/wordprocessingInk" xmlns:wne="http://schemas.microsoft.com/office/word/2006/wordml" xmlns:wps="http://schemas.microsoft.com/office/word/2010/wordprocessingShape" mc:Ignorable="w14 w15 w16se w16cid w16 w16cex w16sdtdh wp14">
   <w:endnote w:type="separator" w:id="-1">
     <w:p>
       <w:r>
@@ -2873,7 +4531,7 @@
 </file>
 
 <file path=word/footer1.xml><?xml version="1.0" encoding="utf-8"?>
-<w:ftr xmlns:wpc="http://schemas.microsoft.com/office/word/2010/wordprocessingCanvas" xmlns:cx="http://schemas.microsoft.com/office/drawing/2014/chartex" xmlns:cx1="http://schemas.microsoft.com/office/drawing/2015/9/8/chartex" xmlns:cx2="http://schemas.microsoft.com/office/drawing/2015/10/21/chartex" xmlns:cx3="http://schemas.microsoft.com/office/drawing/2016/5/9/chartex" xmlns:cx4="http://schemas.microsoft.com/office/drawing/2016/5/10/chartex" xmlns:cx5="http://schemas.microsoft.com/office/drawing/2016/5/11/chartex" xmlns:cx6="http://schemas.microsoft.com/office/drawing/2016/5/12/chartex" xmlns:cx7="http://schemas.microsoft.com/office/drawing/2016/5/13/chartex" xmlns:cx8="http://schemas.microsoft.com/office/drawing/2016/5/14/chartex" xmlns:mc="http://schemas.openxmlformats.org/markup-compatibility/2006" xmlns:aink="http://schemas.microsoft.com/office/drawing/2016/ink" xmlns:am3d="http://schemas.microsoft.com/office/drawing/2017/model3d" xmlns:o="urn:schemas-microsoft-com:office:office" xmlns:oel="http://schemas.microsoft.com/office/2019/extlst" xmlns:r="http://schemas.openxmlformats.org/officeDocument/2006/relationships" xmlns:m="http://schemas.openxmlformats.org/officeDocument/2006/math" xmlns:v="urn:schemas-microsoft-com:vml" xmlns:wp14="http://schemas.microsoft.com/office/word/2010/wordprocessingDrawing" xmlns:wp="http://schemas.openxmlformats.org/drawingml/2006/wordprocessingDrawing" xmlns:w10="urn:schemas-microsoft-com:office:word" xmlns:w="http://schemas.openxmlformats.org/wordprocessingml/2006/main" xmlns:w14="http://schemas.microsoft.com/office/word/2010/wordml" xmlns:w15="http://schemas.microsoft.com/office/word/2012/wordml" xmlns:w16cex="http://schemas.microsoft.com/office/word/2018/wordml/cex" xmlns:w16cid="http://schemas.microsoft.com/office/word/2016/wordml/cid" xmlns:w16="http://schemas.microsoft.com/office/word/2018/wordml" xmlns:w16du="http://schemas.microsoft.com/office/word/2023/wordml/word16du" xmlns:w16sdtdh="http://schemas.microsoft.com/office/word/2020/wordml/sdtdatahash" xmlns:w16sdtfl="http://schemas.microsoft.com/office/word/2024/wordml/sdtformatlock" xmlns:w16se="http://schemas.microsoft.com/office/word/2015/wordml/symex" xmlns:wpg="http://schemas.microsoft.com/office/word/2010/wordprocessingGroup" xmlns:wpi="http://schemas.microsoft.com/office/word/2010/wordprocessingInk" xmlns:wne="http://schemas.microsoft.com/office/word/2006/wordml" xmlns:wps="http://schemas.microsoft.com/office/word/2010/wordprocessingShape" mc:Ignorable="w14 w15 w16se w16cid w16 w16cex w16sdtdh w16sdtfl w16du wp14">
+<w:ftr xmlns:wpc="http://schemas.microsoft.com/office/word/2010/wordprocessingCanvas" xmlns:cx="http://schemas.microsoft.com/office/drawing/2014/chartex" xmlns:cx1="http://schemas.microsoft.com/office/drawing/2015/9/8/chartex" xmlns:cx2="http://schemas.microsoft.com/office/drawing/2015/10/21/chartex" xmlns:cx3="http://schemas.microsoft.com/office/drawing/2016/5/9/chartex" xmlns:cx4="http://schemas.microsoft.com/office/drawing/2016/5/10/chartex" xmlns:cx5="http://schemas.microsoft.com/office/drawing/2016/5/11/chartex" xmlns:cx6="http://schemas.microsoft.com/office/drawing/2016/5/12/chartex" xmlns:cx7="http://schemas.microsoft.com/office/drawing/2016/5/13/chartex" xmlns:cx8="http://schemas.microsoft.com/office/drawing/2016/5/14/chartex" xmlns:mc="http://schemas.openxmlformats.org/markup-compatibility/2006" xmlns:aink="http://schemas.microsoft.com/office/drawing/2016/ink" xmlns:am3d="http://schemas.microsoft.com/office/drawing/2017/model3d" xmlns:o="urn:schemas-microsoft-com:office:office" xmlns:oel="http://schemas.microsoft.com/office/2019/extlst" xmlns:r="http://schemas.openxmlformats.org/officeDocument/2006/relationships" xmlns:m="http://schemas.openxmlformats.org/officeDocument/2006/math" xmlns:v="urn:schemas-microsoft-com:vml" xmlns:wp14="http://schemas.microsoft.com/office/word/2010/wordprocessingDrawing" xmlns:wp="http://schemas.openxmlformats.org/drawingml/2006/wordprocessingDrawing" xmlns:w10="urn:schemas-microsoft-com:office:word" xmlns:w="http://schemas.openxmlformats.org/wordprocessingml/2006/main" xmlns:w14="http://schemas.microsoft.com/office/word/2010/wordml" xmlns:w15="http://schemas.microsoft.com/office/word/2012/wordml" xmlns:w16cex="http://schemas.microsoft.com/office/word/2018/wordml/cex" xmlns:w16cid="http://schemas.microsoft.com/office/word/2016/wordml/cid" xmlns:w16="http://schemas.microsoft.com/office/word/2018/wordml" xmlns:w16sdtdh="http://schemas.microsoft.com/office/word/2020/wordml/sdtdatahash" xmlns:w16se="http://schemas.microsoft.com/office/word/2015/wordml/symex" xmlns:wpg="http://schemas.microsoft.com/office/word/2010/wordprocessingGroup" xmlns:wpi="http://schemas.microsoft.com/office/word/2010/wordprocessingInk" xmlns:wne="http://schemas.microsoft.com/office/word/2006/wordml" xmlns:wps="http://schemas.microsoft.com/office/word/2010/wordprocessingShape" mc:Ignorable="w14 w15 w16se w16cid w16 w16cex w16sdtdh wp14">
   <w:tbl>
     <w:tblPr>
       <w:tblStyle w:val="Grilledutableau"/>
@@ -3325,7 +4983,7 @@
               <w:noProof/>
               <w:szCs w:val="16"/>
             </w:rPr>
-            <w:t>00.00.0000 00:00</w:t>
+            <w:t>27.09.2025 18:31</w:t>
           </w:r>
           <w:r>
             <w:rPr>
@@ -3378,7 +5036,7 @@
 </file>
 
 <file path=word/footnotes.xml><?xml version="1.0" encoding="utf-8"?>
-<w:footnotes xmlns:wpc="http://schemas.microsoft.com/office/word/2010/wordprocessingCanvas" xmlns:cx="http://schemas.microsoft.com/office/drawing/2014/chartex" xmlns:cx1="http://schemas.microsoft.com/office/drawing/2015/9/8/chartex" xmlns:cx2="http://schemas.microsoft.com/office/drawing/2015/10/21/chartex" xmlns:cx3="http://schemas.microsoft.com/office/drawing/2016/5/9/chartex" xmlns:cx4="http://schemas.microsoft.com/office/drawing/2016/5/10/chartex" xmlns:cx5="http://schemas.microsoft.com/office/drawing/2016/5/11/chartex" xmlns:cx6="http://schemas.microsoft.com/office/drawing/2016/5/12/chartex" xmlns:cx7="http://schemas.microsoft.com/office/drawing/2016/5/13/chartex" xmlns:cx8="http://schemas.microsoft.com/office/drawing/2016/5/14/chartex" xmlns:mc="http://schemas.openxmlformats.org/markup-compatibility/2006" xmlns:aink="http://schemas.microsoft.com/office/drawing/2016/ink" xmlns:am3d="http://schemas.microsoft.com/office/drawing/2017/model3d" xmlns:o="urn:schemas-microsoft-com:office:office" xmlns:oel="http://schemas.microsoft.com/office/2019/extlst" xmlns:r="http://schemas.openxmlformats.org/officeDocument/2006/relationships" xmlns:m="http://schemas.openxmlformats.org/officeDocument/2006/math" xmlns:v="urn:schemas-microsoft-com:vml" xmlns:wp14="http://schemas.microsoft.com/office/word/2010/wordprocessingDrawing" xmlns:wp="http://schemas.openxmlformats.org/drawingml/2006/wordprocessingDrawing" xmlns:w10="urn:schemas-microsoft-com:office:word" xmlns:w="http://schemas.openxmlformats.org/wordprocessingml/2006/main" xmlns:w14="http://schemas.microsoft.com/office/word/2010/wordml" xmlns:w15="http://schemas.microsoft.com/office/word/2012/wordml" xmlns:w16cex="http://schemas.microsoft.com/office/word/2018/wordml/cex" xmlns:w16cid="http://schemas.microsoft.com/office/word/2016/wordml/cid" xmlns:w16="http://schemas.microsoft.com/office/word/2018/wordml" xmlns:w16du="http://schemas.microsoft.com/office/word/2023/wordml/word16du" xmlns:w16sdtdh="http://schemas.microsoft.com/office/word/2020/wordml/sdtdatahash" xmlns:w16sdtfl="http://schemas.microsoft.com/office/word/2024/wordml/sdtformatlock" xmlns:w16se="http://schemas.microsoft.com/office/word/2015/wordml/symex" xmlns:wpg="http://schemas.microsoft.com/office/word/2010/wordprocessingGroup" xmlns:wpi="http://schemas.microsoft.com/office/word/2010/wordprocessingInk" xmlns:wne="http://schemas.microsoft.com/office/word/2006/wordml" xmlns:wps="http://schemas.microsoft.com/office/word/2010/wordprocessingShape" mc:Ignorable="w14 w15 w16se w16cid w16 w16cex w16sdtdh w16sdtfl w16du wp14">
+<w:footnotes xmlns:wpc="http://schemas.microsoft.com/office/word/2010/wordprocessingCanvas" xmlns:cx="http://schemas.microsoft.com/office/drawing/2014/chartex" xmlns:cx1="http://schemas.microsoft.com/office/drawing/2015/9/8/chartex" xmlns:cx2="http://schemas.microsoft.com/office/drawing/2015/10/21/chartex" xmlns:cx3="http://schemas.microsoft.com/office/drawing/2016/5/9/chartex" xmlns:cx4="http://schemas.microsoft.com/office/drawing/2016/5/10/chartex" xmlns:cx5="http://schemas.microsoft.com/office/drawing/2016/5/11/chartex" xmlns:cx6="http://schemas.microsoft.com/office/drawing/2016/5/12/chartex" xmlns:cx7="http://schemas.microsoft.com/office/drawing/2016/5/13/chartex" xmlns:cx8="http://schemas.microsoft.com/office/drawing/2016/5/14/chartex" xmlns:mc="http://schemas.openxmlformats.org/markup-compatibility/2006" xmlns:aink="http://schemas.microsoft.com/office/drawing/2016/ink" xmlns:am3d="http://schemas.microsoft.com/office/drawing/2017/model3d" xmlns:o="urn:schemas-microsoft-com:office:office" xmlns:oel="http://schemas.microsoft.com/office/2019/extlst" xmlns:r="http://schemas.openxmlformats.org/officeDocument/2006/relationships" xmlns:m="http://schemas.openxmlformats.org/officeDocument/2006/math" xmlns:v="urn:schemas-microsoft-com:vml" xmlns:wp14="http://schemas.microsoft.com/office/word/2010/wordprocessingDrawing" xmlns:wp="http://schemas.openxmlformats.org/drawingml/2006/wordprocessingDrawing" xmlns:w10="urn:schemas-microsoft-com:office:word" xmlns:w="http://schemas.openxmlformats.org/wordprocessingml/2006/main" xmlns:w14="http://schemas.microsoft.com/office/word/2010/wordml" xmlns:w15="http://schemas.microsoft.com/office/word/2012/wordml" xmlns:w16cex="http://schemas.microsoft.com/office/word/2018/wordml/cex" xmlns:w16cid="http://schemas.microsoft.com/office/word/2016/wordml/cid" xmlns:w16="http://schemas.microsoft.com/office/word/2018/wordml" xmlns:w16sdtdh="http://schemas.microsoft.com/office/word/2020/wordml/sdtdatahash" xmlns:w16se="http://schemas.microsoft.com/office/word/2015/wordml/symex" xmlns:wpg="http://schemas.microsoft.com/office/word/2010/wordprocessingGroup" xmlns:wpi="http://schemas.microsoft.com/office/word/2010/wordprocessingInk" xmlns:wne="http://schemas.microsoft.com/office/word/2006/wordml" xmlns:wps="http://schemas.microsoft.com/office/word/2010/wordprocessingShape" mc:Ignorable="w14 w15 w16se w16cid w16 w16cex w16sdtdh wp14">
   <w:footnote w:type="separator" w:id="-1">
     <w:p>
       <w:r>
@@ -3397,7 +5055,7 @@
 </file>
 
 <file path=word/header1.xml><?xml version="1.0" encoding="utf-8"?>
-<w:hdr xmlns:wpc="http://schemas.microsoft.com/office/word/2010/wordprocessingCanvas" xmlns:cx="http://schemas.microsoft.com/office/drawing/2014/chartex" xmlns:cx1="http://schemas.microsoft.com/office/drawing/2015/9/8/chartex" xmlns:cx2="http://schemas.microsoft.com/office/drawing/2015/10/21/chartex" xmlns:cx3="http://schemas.microsoft.com/office/drawing/2016/5/9/chartex" xmlns:cx4="http://schemas.microsoft.com/office/drawing/2016/5/10/chartex" xmlns:cx5="http://schemas.microsoft.com/office/drawing/2016/5/11/chartex" xmlns:cx6="http://schemas.microsoft.com/office/drawing/2016/5/12/chartex" xmlns:cx7="http://schemas.microsoft.com/office/drawing/2016/5/13/chartex" xmlns:cx8="http://schemas.microsoft.com/office/drawing/2016/5/14/chartex" xmlns:mc="http://schemas.openxmlformats.org/markup-compatibility/2006" xmlns:aink="http://schemas.microsoft.com/office/drawing/2016/ink" xmlns:am3d="http://schemas.microsoft.com/office/drawing/2017/model3d" xmlns:o="urn:schemas-microsoft-com:office:office" xmlns:oel="http://schemas.microsoft.com/office/2019/extlst" xmlns:r="http://schemas.openxmlformats.org/officeDocument/2006/relationships" xmlns:m="http://schemas.openxmlformats.org/officeDocument/2006/math" xmlns:v="urn:schemas-microsoft-com:vml" xmlns:wp14="http://schemas.microsoft.com/office/word/2010/wordprocessingDrawing" xmlns:wp="http://schemas.openxmlformats.org/drawingml/2006/wordprocessingDrawing" xmlns:w10="urn:schemas-microsoft-com:office:word" xmlns:w="http://schemas.openxmlformats.org/wordprocessingml/2006/main" xmlns:w14="http://schemas.microsoft.com/office/word/2010/wordml" xmlns:w15="http://schemas.microsoft.com/office/word/2012/wordml" xmlns:w16cex="http://schemas.microsoft.com/office/word/2018/wordml/cex" xmlns:w16cid="http://schemas.microsoft.com/office/word/2016/wordml/cid" xmlns:w16="http://schemas.microsoft.com/office/word/2018/wordml" xmlns:w16du="http://schemas.microsoft.com/office/word/2023/wordml/word16du" xmlns:w16sdtdh="http://schemas.microsoft.com/office/word/2020/wordml/sdtdatahash" xmlns:w16sdtfl="http://schemas.microsoft.com/office/word/2024/wordml/sdtformatlock" xmlns:w16se="http://schemas.microsoft.com/office/word/2015/wordml/symex" xmlns:wpg="http://schemas.microsoft.com/office/word/2010/wordprocessingGroup" xmlns:wpi="http://schemas.microsoft.com/office/word/2010/wordprocessingInk" xmlns:wne="http://schemas.microsoft.com/office/word/2006/wordml" xmlns:wps="http://schemas.microsoft.com/office/word/2010/wordprocessingShape" mc:Ignorable="w14 w15 w16se w16cid w16 w16cex w16sdtdh w16sdtfl w16du wp14">
+<w:hdr xmlns:wpc="http://schemas.microsoft.com/office/word/2010/wordprocessingCanvas" xmlns:cx="http://schemas.microsoft.com/office/drawing/2014/chartex" xmlns:cx1="http://schemas.microsoft.com/office/drawing/2015/9/8/chartex" xmlns:cx2="http://schemas.microsoft.com/office/drawing/2015/10/21/chartex" xmlns:cx3="http://schemas.microsoft.com/office/drawing/2016/5/9/chartex" xmlns:cx4="http://schemas.microsoft.com/office/drawing/2016/5/10/chartex" xmlns:cx5="http://schemas.microsoft.com/office/drawing/2016/5/11/chartex" xmlns:cx6="http://schemas.microsoft.com/office/drawing/2016/5/12/chartex" xmlns:cx7="http://schemas.microsoft.com/office/drawing/2016/5/13/chartex" xmlns:cx8="http://schemas.microsoft.com/office/drawing/2016/5/14/chartex" xmlns:mc="http://schemas.openxmlformats.org/markup-compatibility/2006" xmlns:aink="http://schemas.microsoft.com/office/drawing/2016/ink" xmlns:am3d="http://schemas.microsoft.com/office/drawing/2017/model3d" xmlns:o="urn:schemas-microsoft-com:office:office" xmlns:oel="http://schemas.microsoft.com/office/2019/extlst" xmlns:r="http://schemas.openxmlformats.org/officeDocument/2006/relationships" xmlns:m="http://schemas.openxmlformats.org/officeDocument/2006/math" xmlns:v="urn:schemas-microsoft-com:vml" xmlns:wp14="http://schemas.microsoft.com/office/word/2010/wordprocessingDrawing" xmlns:wp="http://schemas.openxmlformats.org/drawingml/2006/wordprocessingDrawing" xmlns:w10="urn:schemas-microsoft-com:office:word" xmlns:w="http://schemas.openxmlformats.org/wordprocessingml/2006/main" xmlns:w14="http://schemas.microsoft.com/office/word/2010/wordml" xmlns:w15="http://schemas.microsoft.com/office/word/2012/wordml" xmlns:w16cex="http://schemas.microsoft.com/office/word/2018/wordml/cex" xmlns:w16cid="http://schemas.microsoft.com/office/word/2016/wordml/cid" xmlns:w16="http://schemas.microsoft.com/office/word/2018/wordml" xmlns:w16sdtdh="http://schemas.microsoft.com/office/word/2020/wordml/sdtdatahash" xmlns:w16se="http://schemas.microsoft.com/office/word/2015/wordml/symex" xmlns:wpg="http://schemas.microsoft.com/office/word/2010/wordprocessingGroup" xmlns:wpi="http://schemas.microsoft.com/office/word/2010/wordprocessingInk" xmlns:wne="http://schemas.microsoft.com/office/word/2006/wordml" xmlns:wps="http://schemas.microsoft.com/office/word/2010/wordprocessingShape" mc:Ignorable="w14 w15 w16se w16cid w16 w16cex w16sdtdh wp14">
   <w:tbl>
     <w:tblPr>
       <w:tblStyle w:val="Grilledutableau"/>
@@ -3412,9 +5070,9 @@
       <w:tblLook w:val="01E0" w:firstRow="1" w:lastRow="1" w:firstColumn="1" w:lastColumn="1" w:noHBand="0" w:noVBand="0"/>
     </w:tblPr>
     <w:tblGrid>
-      <w:gridCol w:w="2390"/>
-      <w:gridCol w:w="4411"/>
-      <w:gridCol w:w="2269"/>
+      <w:gridCol w:w="2402"/>
+      <w:gridCol w:w="4400"/>
+      <w:gridCol w:w="2268"/>
     </w:tblGrid>
     <w:tr>
       <w:trPr>
@@ -3515,7 +5173,7 @@
 </file>
 
 <file path=word/numbering.xml><?xml version="1.0" encoding="utf-8"?>
-<w:numbering xmlns:wpc="http://schemas.microsoft.com/office/word/2010/wordprocessingCanvas" xmlns:cx="http://schemas.microsoft.com/office/drawing/2014/chartex" xmlns:cx1="http://schemas.microsoft.com/office/drawing/2015/9/8/chartex" xmlns:cx2="http://schemas.microsoft.com/office/drawing/2015/10/21/chartex" xmlns:cx3="http://schemas.microsoft.com/office/drawing/2016/5/9/chartex" xmlns:cx4="http://schemas.microsoft.com/office/drawing/2016/5/10/chartex" xmlns:cx5="http://schemas.microsoft.com/office/drawing/2016/5/11/chartex" xmlns:cx6="http://schemas.microsoft.com/office/drawing/2016/5/12/chartex" xmlns:cx7="http://schemas.microsoft.com/office/drawing/2016/5/13/chartex" xmlns:cx8="http://schemas.microsoft.com/office/drawing/2016/5/14/chartex" xmlns:mc="http://schemas.openxmlformats.org/markup-compatibility/2006" xmlns:aink="http://schemas.microsoft.com/office/drawing/2016/ink" xmlns:am3d="http://schemas.microsoft.com/office/drawing/2017/model3d" xmlns:o="urn:schemas-microsoft-com:office:office" xmlns:oel="http://schemas.microsoft.com/office/2019/extlst" xmlns:r="http://schemas.openxmlformats.org/officeDocument/2006/relationships" xmlns:m="http://schemas.openxmlformats.org/officeDocument/2006/math" xmlns:v="urn:schemas-microsoft-com:vml" xmlns:wp14="http://schemas.microsoft.com/office/word/2010/wordprocessingDrawing" xmlns:wp="http://schemas.openxmlformats.org/drawingml/2006/wordprocessingDrawing" xmlns:w10="urn:schemas-microsoft-com:office:word" xmlns:w="http://schemas.openxmlformats.org/wordprocessingml/2006/main" xmlns:w14="http://schemas.microsoft.com/office/word/2010/wordml" xmlns:w15="http://schemas.microsoft.com/office/word/2012/wordml" xmlns:w16cex="http://schemas.microsoft.com/office/word/2018/wordml/cex" xmlns:w16cid="http://schemas.microsoft.com/office/word/2016/wordml/cid" xmlns:w16="http://schemas.microsoft.com/office/word/2018/wordml" xmlns:w16du="http://schemas.microsoft.com/office/word/2023/wordml/word16du" xmlns:w16sdtdh="http://schemas.microsoft.com/office/word/2020/wordml/sdtdatahash" xmlns:w16sdtfl="http://schemas.microsoft.com/office/word/2024/wordml/sdtformatlock" xmlns:w16se="http://schemas.microsoft.com/office/word/2015/wordml/symex" xmlns:wpg="http://schemas.microsoft.com/office/word/2010/wordprocessingGroup" xmlns:wpi="http://schemas.microsoft.com/office/word/2010/wordprocessingInk" xmlns:wne="http://schemas.microsoft.com/office/word/2006/wordml" xmlns:wps="http://schemas.microsoft.com/office/word/2010/wordprocessingShape" mc:Ignorable="w14 w15 w16se w16cid w16 w16cex w16sdtdh w16sdtfl w16du wp14">
+<w:numbering xmlns:wpc="http://schemas.microsoft.com/office/word/2010/wordprocessingCanvas" xmlns:cx="http://schemas.microsoft.com/office/drawing/2014/chartex" xmlns:cx1="http://schemas.microsoft.com/office/drawing/2015/9/8/chartex" xmlns:cx2="http://schemas.microsoft.com/office/drawing/2015/10/21/chartex" xmlns:cx3="http://schemas.microsoft.com/office/drawing/2016/5/9/chartex" xmlns:cx4="http://schemas.microsoft.com/office/drawing/2016/5/10/chartex" xmlns:cx5="http://schemas.microsoft.com/office/drawing/2016/5/11/chartex" xmlns:cx6="http://schemas.microsoft.com/office/drawing/2016/5/12/chartex" xmlns:cx7="http://schemas.microsoft.com/office/drawing/2016/5/13/chartex" xmlns:cx8="http://schemas.microsoft.com/office/drawing/2016/5/14/chartex" xmlns:mc="http://schemas.openxmlformats.org/markup-compatibility/2006" xmlns:aink="http://schemas.microsoft.com/office/drawing/2016/ink" xmlns:am3d="http://schemas.microsoft.com/office/drawing/2017/model3d" xmlns:o="urn:schemas-microsoft-com:office:office" xmlns:oel="http://schemas.microsoft.com/office/2019/extlst" xmlns:r="http://schemas.openxmlformats.org/officeDocument/2006/relationships" xmlns:m="http://schemas.openxmlformats.org/officeDocument/2006/math" xmlns:v="urn:schemas-microsoft-com:vml" xmlns:wp14="http://schemas.microsoft.com/office/word/2010/wordprocessingDrawing" xmlns:wp="http://schemas.openxmlformats.org/drawingml/2006/wordprocessingDrawing" xmlns:w10="urn:schemas-microsoft-com:office:word" xmlns:w="http://schemas.openxmlformats.org/wordprocessingml/2006/main" xmlns:w14="http://schemas.microsoft.com/office/word/2010/wordml" xmlns:w15="http://schemas.microsoft.com/office/word/2012/wordml" xmlns:w16cex="http://schemas.microsoft.com/office/word/2018/wordml/cex" xmlns:w16cid="http://schemas.microsoft.com/office/word/2016/wordml/cid" xmlns:w16="http://schemas.microsoft.com/office/word/2018/wordml" xmlns:w16sdtdh="http://schemas.microsoft.com/office/word/2020/wordml/sdtdatahash" xmlns:w16se="http://schemas.microsoft.com/office/word/2015/wordml/symex" xmlns:wpg="http://schemas.microsoft.com/office/word/2010/wordprocessingGroup" xmlns:wpi="http://schemas.microsoft.com/office/word/2010/wordprocessingInk" xmlns:wne="http://schemas.microsoft.com/office/word/2006/wordml" xmlns:wps="http://schemas.microsoft.com/office/word/2010/wordprocessingShape" mc:Ignorable="w14 w15 w16se w16cid w16 w16cex w16sdtdh wp14">
   <w:numPicBullet w:numPicBulletId="0">
     <w:pict>
       <v:shapetype id="_x0000_t75" coordsize="21600,21600" o:spt="75" o:preferrelative="t" path="m@4@5l@4@11@9@11@9@5xe" filled="f" stroked="f">
@@ -3537,7 +5195,7 @@
         <v:path o:extrusionok="f" gradientshapeok="t" o:connecttype="rect"/>
         <o:lock v:ext="edit" aspectratio="t"/>
       </v:shapetype>
-      <v:shape id="_x0000_i1029" type="#_x0000_t75" style="width:11.15pt;height:11.15pt" o:bullet="t">
+      <v:shape id="_x0000_i1113" type="#_x0000_t75" style="width:11.3pt;height:11.3pt" o:bullet="t">
         <v:imagedata r:id="rId1" o:title="BD10263_"/>
       </v:shape>
     </w:pict>
@@ -4830,7 +6488,7 @@
   <w:abstractNum w:abstractNumId="20" w15:restartNumberingAfterBreak="0">
     <w:nsid w:val="2A8F67FD"/>
     <w:multiLevelType w:val="multilevel"/>
-    <w:tmpl w:val="08EA5668"/>
+    <w:tmpl w:val="D8DC1A5C"/>
     <w:lvl w:ilvl="0">
       <w:start w:val="1"/>
       <w:numFmt w:val="decimal"/>
@@ -7152,12 +8810,75 @@
   <w:num w:numId="47" w16cid:durableId="1578444669">
     <w:abstractNumId w:val="32"/>
   </w:num>
+  <w:num w:numId="48" w16cid:durableId="1079402818">
+    <w:abstractNumId w:val="20"/>
+    <w:lvlOverride w:ilvl="0">
+      <w:startOverride w:val="1"/>
+    </w:lvlOverride>
+    <w:lvlOverride w:ilvl="1">
+      <w:startOverride w:val="1"/>
+    </w:lvlOverride>
+    <w:lvlOverride w:ilvl="2">
+      <w:startOverride w:val="1"/>
+    </w:lvlOverride>
+    <w:lvlOverride w:ilvl="3">
+      <w:startOverride w:val="1"/>
+    </w:lvlOverride>
+    <w:lvlOverride w:ilvl="4">
+      <w:startOverride w:val="1"/>
+    </w:lvlOverride>
+    <w:lvlOverride w:ilvl="5">
+      <w:startOverride w:val="1"/>
+    </w:lvlOverride>
+    <w:lvlOverride w:ilvl="6">
+      <w:startOverride w:val="1"/>
+    </w:lvlOverride>
+    <w:lvlOverride w:ilvl="7">
+      <w:startOverride w:val="1"/>
+    </w:lvlOverride>
+    <w:lvlOverride w:ilvl="8">
+      <w:startOverride w:val="1"/>
+    </w:lvlOverride>
+  </w:num>
+  <w:num w:numId="49" w16cid:durableId="154959160">
+    <w:abstractNumId w:val="20"/>
+    <w:lvlOverride w:ilvl="0">
+      <w:startOverride w:val="1"/>
+    </w:lvlOverride>
+    <w:lvlOverride w:ilvl="1">
+      <w:startOverride w:val="1"/>
+    </w:lvlOverride>
+    <w:lvlOverride w:ilvl="2">
+      <w:startOverride w:val="1"/>
+    </w:lvlOverride>
+    <w:lvlOverride w:ilvl="3">
+      <w:startOverride w:val="1"/>
+    </w:lvlOverride>
+    <w:lvlOverride w:ilvl="4">
+      <w:startOverride w:val="1"/>
+    </w:lvlOverride>
+    <w:lvlOverride w:ilvl="5">
+      <w:startOverride w:val="1"/>
+    </w:lvlOverride>
+    <w:lvlOverride w:ilvl="6">
+      <w:startOverride w:val="1"/>
+    </w:lvlOverride>
+    <w:lvlOverride w:ilvl="7">
+      <w:startOverride w:val="1"/>
+    </w:lvlOverride>
+    <w:lvlOverride w:ilvl="8">
+      <w:startOverride w:val="1"/>
+    </w:lvlOverride>
+  </w:num>
+  <w:num w:numId="50" w16cid:durableId="1151753768">
+    <w:abstractNumId w:val="20"/>
+  </w:num>
   <w:numIdMacAtCleanup w:val="4"/>
 </w:numbering>
 </file>
 
 <file path=word/styles.xml><?xml version="1.0" encoding="utf-8"?>
-<w:styles xmlns:mc="http://schemas.openxmlformats.org/markup-compatibility/2006" xmlns:r="http://schemas.openxmlformats.org/officeDocument/2006/relationships" xmlns:w="http://schemas.openxmlformats.org/wordprocessingml/2006/main" xmlns:w14="http://schemas.microsoft.com/office/word/2010/wordml" xmlns:w15="http://schemas.microsoft.com/office/word/2012/wordml" xmlns:w16cex="http://schemas.microsoft.com/office/word/2018/wordml/cex" xmlns:w16cid="http://schemas.microsoft.com/office/word/2016/wordml/cid" xmlns:w16="http://schemas.microsoft.com/office/word/2018/wordml" xmlns:w16du="http://schemas.microsoft.com/office/word/2023/wordml/word16du" xmlns:w16sdtdh="http://schemas.microsoft.com/office/word/2020/wordml/sdtdatahash" xmlns:w16sdtfl="http://schemas.microsoft.com/office/word/2024/wordml/sdtformatlock" xmlns:w16se="http://schemas.microsoft.com/office/word/2015/wordml/symex" mc:Ignorable="w14 w15 w16se w16cid w16 w16cex w16sdtdh w16sdtfl w16du">
+<w:styles xmlns:mc="http://schemas.openxmlformats.org/markup-compatibility/2006" xmlns:r="http://schemas.openxmlformats.org/officeDocument/2006/relationships" xmlns:w="http://schemas.openxmlformats.org/wordprocessingml/2006/main" xmlns:w14="http://schemas.microsoft.com/office/word/2010/wordml" xmlns:w15="http://schemas.microsoft.com/office/word/2012/wordml" xmlns:w16cex="http://schemas.microsoft.com/office/word/2018/wordml/cex" xmlns:w16cid="http://schemas.microsoft.com/office/word/2016/wordml/cid" xmlns:w16="http://schemas.microsoft.com/office/word/2018/wordml" xmlns:w16sdtdh="http://schemas.microsoft.com/office/word/2020/wordml/sdtdatahash" xmlns:w16se="http://schemas.microsoft.com/office/word/2015/wordml/symex" mc:Ignorable="w14 w15 w16se w16cid w16 w16cex w16sdtdh">
   <w:docDefaults>
     <w:rPrDefault>
       <w:rPr>
@@ -7573,9 +9294,10 @@
     <w:name w:val="heading 2"/>
     <w:basedOn w:val="Normal"/>
     <w:next w:val="Retraitcorpsdetexte"/>
+    <w:link w:val="Titre2Car"/>
     <w:autoRedefine/>
     <w:qFormat/>
-    <w:rsid w:val="00AA4393"/>
+    <w:rsid w:val="002128F0"/>
     <w:pPr>
       <w:keepNext/>
       <w:numPr>
@@ -7743,7 +9465,6 @@
   <w:style w:type="character" w:default="1" w:styleId="Policepardfaut">
     <w:name w:val="Default Paragraph Font"/>
     <w:uiPriority w:val="1"/>
-    <w:semiHidden/>
     <w:unhideWhenUsed/>
   </w:style>
   <w:style w:type="table" w:default="1" w:styleId="TableauNormal">
@@ -8262,6 +9983,20 @@
       <w:rFonts w:asciiTheme="majorHAnsi" w:hAnsiTheme="majorHAnsi"/>
     </w:rPr>
   </w:style>
+  <w:style w:type="character" w:customStyle="1" w:styleId="Titre2Car">
+    <w:name w:val="Titre 2 Car"/>
+    <w:basedOn w:val="Policepardfaut"/>
+    <w:link w:val="Titre2"/>
+    <w:rsid w:val="002128F0"/>
+    <w:rPr>
+      <w:rFonts w:asciiTheme="majorHAnsi" w:hAnsiTheme="majorHAnsi" w:cs="Arial"/>
+      <w:b/>
+      <w:bCs/>
+      <w:iCs/>
+      <w:sz w:val="28"/>
+      <w:szCs w:val="28"/>
+    </w:rPr>
+  </w:style>
 </w:styles>
 </file>
 
@@ -8552,6 +10287,15 @@
 </file>
 
 <file path=customXml/item1.xml><?xml version="1.0" encoding="utf-8"?>
+<?mso-contentType ?>
+<FormTemplates xmlns="http://schemas.microsoft.com/sharepoint/v3/contenttype/forms">
+  <Display>DocumentLibraryForm</Display>
+  <Edit>DocumentLibraryForm</Edit>
+  <New>DocumentLibraryForm</New>
+</FormTemplates>
+</file>
+
+<file path=customXml/item2.xml><?xml version="1.0" encoding="utf-8"?>
 <p:properties xmlns:p="http://schemas.microsoft.com/office/2006/metadata/properties" xmlns:xsi="http://www.w3.org/2001/XMLSchema-instance" xmlns:pc="http://schemas.microsoft.com/office/infopath/2007/PartnerControls">
   <documentManagement>
     <lcf76f155ced4ddcb4097134ff3c332f xmlns="a1b10758-7132-46a4-a2fe-7a2cf46f51f4">
@@ -8562,16 +10306,11 @@
 </p:properties>
 </file>
 
-<file path=customXml/item2.xml><?xml version="1.0" encoding="utf-8"?>
-<?mso-contentType ?>
-<FormTemplates xmlns="http://schemas.microsoft.com/sharepoint/v3/contenttype/forms">
-  <Display>DocumentLibraryForm</Display>
-  <Edit>DocumentLibraryForm</Edit>
-  <New>DocumentLibraryForm</New>
-</FormTemplates>
+<file path=customXml/item3.xml><?xml version="1.0" encoding="utf-8"?>
+<b:Sources xmlns:b="http://schemas.openxmlformats.org/officeDocument/2006/bibliography" xmlns="http://schemas.openxmlformats.org/officeDocument/2006/bibliography" SelectedStyle="\APA.XSL" StyleName="APA"/>
 </file>
 
-<file path=customXml/item3.xml><?xml version="1.0" encoding="utf-8"?>
+<file path=customXml/item4.xml><?xml version="1.0" encoding="utf-8"?>
 <ct:contentTypeSchema xmlns:ct="http://schemas.microsoft.com/office/2006/metadata/contentType" xmlns:ma="http://schemas.microsoft.com/office/2006/metadata/properties/metaAttributes" ct:_="" ma:_="" ma:contentTypeName="Document" ma:contentTypeID="0x0101005A5B8F5EAAC22C48A11F5D9A60E6F21D" ma:contentTypeVersion="16" ma:contentTypeDescription="Crée un document." ma:contentTypeScope="" ma:versionID="f2b963976306cc54294b7f4545a3c6c4">
   <xsd:schema xmlns:xsd="http://www.w3.org/2001/XMLSchema" xmlns:xs="http://www.w3.org/2001/XMLSchema" xmlns:p="http://schemas.microsoft.com/office/2006/metadata/properties" xmlns:ns2="a1b10758-7132-46a4-a2fe-7a2cf46f51f4" xmlns:ns3="f7d9f5a6-831d-4621-8c77-cbcaf993e406" targetNamespace="http://schemas.microsoft.com/office/2006/metadata/properties" ma:root="true" ma:fieldsID="e5e135fa2fc1295e1586ddcd9c1a8904" ns2:_="" ns3:_="">
     <xsd:import namespace="a1b10758-7132-46a4-a2fe-7a2cf46f51f4"/>
@@ -8814,11 +10553,15 @@
 </ct:contentTypeSchema>
 </file>
 
-<file path=customXml/item4.xml><?xml version="1.0" encoding="utf-8"?>
-<b:Sources xmlns:b="http://schemas.openxmlformats.org/officeDocument/2006/bibliography" xmlns="http://schemas.openxmlformats.org/officeDocument/2006/bibliography" SelectedStyle="\APA.XSL" StyleName="APA"/>
+<file path=customXml/itemProps1.xml><?xml version="1.0" encoding="utf-8"?>
+<ds:datastoreItem xmlns:ds="http://schemas.openxmlformats.org/officeDocument/2006/customXml" ds:itemID="{5E865F57-6285-4B13-9F81-ABD3A2DB1ADD}">
+  <ds:schemaRefs>
+    <ds:schemaRef ds:uri="http://schemas.microsoft.com/sharepoint/v3/contenttype/forms"/>
+  </ds:schemaRefs>
+</ds:datastoreItem>
 </file>
 
-<file path=customXml/itemProps1.xml><?xml version="1.0" encoding="utf-8"?>
+<file path=customXml/itemProps2.xml><?xml version="1.0" encoding="utf-8"?>
 <ds:datastoreItem xmlns:ds="http://schemas.openxmlformats.org/officeDocument/2006/customXml" ds:itemID="{24954833-9F05-49C5-955F-86E47D037F04}">
   <ds:schemaRefs>
     <ds:schemaRef ds:uri="http://schemas.microsoft.com/office/2006/metadata/properties"/>
@@ -8829,15 +10572,15 @@
 </ds:datastoreItem>
 </file>
 
-<file path=customXml/itemProps2.xml><?xml version="1.0" encoding="utf-8"?>
-<ds:datastoreItem xmlns:ds="http://schemas.openxmlformats.org/officeDocument/2006/customXml" ds:itemID="{5E865F57-6285-4B13-9F81-ABD3A2DB1ADD}">
+<file path=customXml/itemProps3.xml><?xml version="1.0" encoding="utf-8"?>
+<ds:datastoreItem xmlns:ds="http://schemas.openxmlformats.org/officeDocument/2006/customXml" ds:itemID="{CC7784B4-F310-4DC4-8DFD-79BD564D2FFE}">
   <ds:schemaRefs>
-    <ds:schemaRef ds:uri="http://schemas.microsoft.com/sharepoint/v3/contenttype/forms"/>
+    <ds:schemaRef ds:uri="http://schemas.openxmlformats.org/officeDocument/2006/bibliography"/>
   </ds:schemaRefs>
 </ds:datastoreItem>
 </file>
 
-<file path=customXml/itemProps3.xml><?xml version="1.0" encoding="utf-8"?>
+<file path=customXml/itemProps4.xml><?xml version="1.0" encoding="utf-8"?>
 <ds:datastoreItem xmlns:ds="http://schemas.openxmlformats.org/officeDocument/2006/customXml" ds:itemID="{C9A788E4-007D-401C-881B-2F70B33A007D}">
   <ds:schemaRefs>
     <ds:schemaRef ds:uri="http://schemas.microsoft.com/office/2006/metadata/contentType"/>
@@ -8854,12 +10597,4 @@
     <ds:schemaRef ds:uri="http://schemas.microsoft.com/internal/obd"/>
   </ds:schemaRefs>
 </ds:datastoreItem>
-</file>
-
-<file path=customXml/itemProps4.xml><?xml version="1.0" encoding="utf-8"?>
-<ds:datastoreItem xmlns:ds="http://schemas.openxmlformats.org/officeDocument/2006/customXml" ds:itemID="{CC7784B4-F310-4DC4-8DFD-79BD564D2FFE}">
-  <ds:schemaRefs>
-    <ds:schemaRef ds:uri="http://schemas.openxmlformats.org/officeDocument/2006/bibliography"/>
-  </ds:schemaRefs>
-</ds:datastoreItem>
 </file>
</xml_diff>